<commit_message>
docs: ajustes de formação no relatório
</commit_message>
<xml_diff>
--- a/docs/t1/Relatorio-T1-TPA.docx
+++ b/docs/t1/Relatorio-T1-TPA.docx
@@ -5,6 +5,7 @@
     <w:p>
       <w:pPr>
         <w:pStyle w:val="Heading1"/>
+        <w:spacing w:line="360" w:lineRule="auto"/>
         <w:jc w:val="center"/>
         <w:rPr>
           <w:rFonts w:ascii="Arial" w:cs="Arial" w:eastAsia="Arial" w:hAnsi="Arial"/>
@@ -22,6 +23,7 @@
     </w:p>
     <w:p>
       <w:pPr>
+        <w:spacing w:line="360" w:lineRule="auto"/>
         <w:rPr/>
       </w:pPr>
       <w:r>
@@ -32,6 +34,7 @@
     </w:p>
     <w:p>
       <w:pPr>
+        <w:spacing w:line="360" w:lineRule="auto"/>
         <w:jc w:val="both"/>
         <w:rPr>
           <w:rFonts w:ascii="Arial" w:cs="Arial" w:eastAsia="Arial" w:hAnsi="Arial"/>
@@ -57,6 +60,7 @@
     <w:p>
       <w:pPr>
         <w:pStyle w:val="Heading1"/>
+        <w:spacing w:line="360" w:lineRule="auto"/>
         <w:jc w:val="both"/>
         <w:rPr>
           <w:sz w:val="32"/>
@@ -81,7 +85,7 @@
     </w:p>
     <w:p>
       <w:pPr>
-        <w:spacing w:line="240" w:lineRule="auto"/>
+        <w:spacing w:line="360" w:lineRule="auto"/>
         <w:jc w:val="both"/>
         <w:rPr>
           <w:rFonts w:ascii="Arial" w:cs="Arial" w:eastAsia="Arial" w:hAnsi="Arial"/>
@@ -95,6 +99,7 @@
     </w:p>
     <w:p>
       <w:pPr>
+        <w:spacing w:line="360" w:lineRule="auto"/>
         <w:jc w:val="both"/>
         <w:rPr>
           <w:rFonts w:ascii="Arial" w:cs="Arial" w:eastAsia="Arial" w:hAnsi="Arial"/>
@@ -110,6 +115,7 @@
     </w:p>
     <w:p>
       <w:pPr>
+        <w:spacing w:line="360" w:lineRule="auto"/>
         <w:ind w:left="720" w:firstLine="0"/>
         <w:jc w:val="both"/>
         <w:rPr>
@@ -128,7 +134,7 @@
           <w:ilvl w:val="0"/>
           <w:numId w:val="1"/>
         </w:numPr>
-        <w:spacing w:after="0" w:lineRule="auto"/>
+        <w:spacing w:after="0" w:line="360" w:lineRule="auto"/>
         <w:ind w:left="720" w:hanging="360"/>
         <w:jc w:val="both"/>
       </w:pPr>
@@ -155,7 +161,7 @@
           <w:ilvl w:val="0"/>
           <w:numId w:val="1"/>
         </w:numPr>
-        <w:spacing w:after="0" w:lineRule="auto"/>
+        <w:spacing w:after="0" w:line="360" w:lineRule="auto"/>
         <w:ind w:left="720" w:hanging="360"/>
         <w:jc w:val="both"/>
       </w:pPr>
@@ -182,6 +188,7 @@
           <w:ilvl w:val="0"/>
           <w:numId w:val="1"/>
         </w:numPr>
+        <w:spacing w:line="360" w:lineRule="auto"/>
         <w:ind w:left="720" w:hanging="360"/>
         <w:jc w:val="both"/>
       </w:pPr>
@@ -204,6 +211,7 @@
     </w:p>
     <w:p>
       <w:pPr>
+        <w:spacing w:line="360" w:lineRule="auto"/>
         <w:jc w:val="both"/>
         <w:rPr>
           <w:rFonts w:ascii="Arial" w:cs="Arial" w:eastAsia="Arial" w:hAnsi="Arial"/>
@@ -219,6 +227,7 @@
     </w:p>
     <w:p>
       <w:pPr>
+        <w:spacing w:line="360" w:lineRule="auto"/>
         <w:jc w:val="both"/>
         <w:rPr>
           <w:rFonts w:ascii="Arial" w:cs="Arial" w:eastAsia="Arial" w:hAnsi="Arial"/>
@@ -234,6 +243,7 @@
     </w:p>
     <w:p>
       <w:pPr>
+        <w:spacing w:line="360" w:lineRule="auto"/>
         <w:jc w:val="both"/>
         <w:rPr>
           <w:rFonts w:ascii="Arial" w:cs="Arial" w:eastAsia="Arial" w:hAnsi="Arial"/>
@@ -253,7 +263,7 @@
           <w:ilvl w:val="0"/>
           <w:numId w:val="3"/>
         </w:numPr>
-        <w:spacing w:after="0" w:lineRule="auto"/>
+        <w:spacing w:after="0" w:line="360" w:lineRule="auto"/>
         <w:ind w:left="720" w:hanging="360"/>
         <w:jc w:val="both"/>
       </w:pPr>
@@ -271,7 +281,7 @@
           <w:ilvl w:val="0"/>
           <w:numId w:val="3"/>
         </w:numPr>
-        <w:spacing w:after="0" w:lineRule="auto"/>
+        <w:spacing w:after="0" w:line="360" w:lineRule="auto"/>
         <w:ind w:left="720" w:hanging="360"/>
         <w:jc w:val="both"/>
       </w:pPr>
@@ -289,6 +299,7 @@
           <w:ilvl w:val="0"/>
           <w:numId w:val="3"/>
         </w:numPr>
+        <w:spacing w:line="360" w:lineRule="auto"/>
         <w:ind w:left="720" w:hanging="360"/>
         <w:jc w:val="both"/>
       </w:pPr>
@@ -302,6 +313,7 @@
     </w:p>
     <w:p>
       <w:pPr>
+        <w:spacing w:line="360" w:lineRule="auto"/>
         <w:jc w:val="both"/>
         <w:rPr>
           <w:rFonts w:ascii="Arial" w:cs="Arial" w:eastAsia="Arial" w:hAnsi="Arial"/>
@@ -336,6 +348,7 @@
     <w:p>
       <w:pPr>
         <w:pStyle w:val="Heading1"/>
+        <w:spacing w:line="360" w:lineRule="auto"/>
         <w:jc w:val="both"/>
         <w:rPr>
           <w:rFonts w:ascii="Arial" w:cs="Arial" w:eastAsia="Arial" w:hAnsi="Arial"/>
@@ -367,7 +380,7 @@
     </w:p>
     <w:p>
       <w:pPr>
-        <w:spacing w:after="120" w:lineRule="auto"/>
+        <w:spacing w:after="120" w:line="360" w:lineRule="auto"/>
         <w:jc w:val="both"/>
         <w:rPr>
           <w:rFonts w:ascii="Arial" w:cs="Arial" w:eastAsia="Arial" w:hAnsi="Arial"/>
@@ -383,7 +396,7 @@
     </w:p>
     <w:p>
       <w:pPr>
-        <w:spacing w:after="120" w:lineRule="auto"/>
+        <w:spacing w:after="120" w:line="360" w:lineRule="auto"/>
         <w:jc w:val="both"/>
         <w:rPr>
           <w:rFonts w:ascii="Arial" w:cs="Arial" w:eastAsia="Arial" w:hAnsi="Arial"/>
@@ -403,7 +416,7 @@
           <w:ilvl w:val="0"/>
           <w:numId w:val="2"/>
         </w:numPr>
-        <w:spacing w:after="0" w:lineRule="auto"/>
+        <w:spacing w:after="0" w:line="360" w:lineRule="auto"/>
         <w:ind w:left="360"/>
         <w:jc w:val="both"/>
       </w:pPr>
@@ -426,7 +439,7 @@
           <w:ilvl w:val="0"/>
           <w:numId w:val="2"/>
         </w:numPr>
-        <w:spacing w:after="0" w:lineRule="auto"/>
+        <w:spacing w:after="0" w:line="360" w:lineRule="auto"/>
         <w:ind w:left="360"/>
         <w:jc w:val="both"/>
       </w:pPr>
@@ -449,7 +462,7 @@
           <w:ilvl w:val="0"/>
           <w:numId w:val="2"/>
         </w:numPr>
-        <w:spacing w:after="0" w:lineRule="auto"/>
+        <w:spacing w:after="0" w:line="360" w:lineRule="auto"/>
         <w:ind w:left="360"/>
         <w:jc w:val="both"/>
       </w:pPr>
@@ -472,7 +485,7 @@
           <w:ilvl w:val="0"/>
           <w:numId w:val="2"/>
         </w:numPr>
-        <w:spacing w:after="60" w:lineRule="auto"/>
+        <w:spacing w:after="60" w:line="360" w:lineRule="auto"/>
         <w:ind w:left="360"/>
         <w:jc w:val="both"/>
       </w:pPr>
@@ -491,7 +504,7 @@
     </w:p>
     <w:p>
       <w:pPr>
-        <w:spacing w:after="120" w:lineRule="auto"/>
+        <w:spacing w:after="120" w:line="360" w:lineRule="auto"/>
         <w:jc w:val="both"/>
         <w:rPr>
           <w:rFonts w:ascii="Arial" w:cs="Arial" w:eastAsia="Arial" w:hAnsi="Arial"/>
@@ -508,6 +521,7 @@
     <w:p>
       <w:pPr>
         <w:pStyle w:val="Heading2"/>
+        <w:spacing w:line="360" w:lineRule="auto"/>
         <w:jc w:val="both"/>
         <w:rPr>
           <w:rFonts w:ascii="Arial" w:cs="Arial" w:eastAsia="Arial" w:hAnsi="Arial"/>
@@ -529,7 +543,7 @@
     </w:p>
     <w:p>
       <w:pPr>
-        <w:spacing w:after="120" w:lineRule="auto"/>
+        <w:spacing w:after="120" w:line="360" w:lineRule="auto"/>
         <w:jc w:val="both"/>
         <w:rPr>
           <w:rFonts w:ascii="Arial" w:cs="Arial" w:eastAsia="Arial" w:hAnsi="Arial"/>
@@ -546,6 +560,7 @@
     <w:p>
       <w:pPr>
         <w:pStyle w:val="Heading2"/>
+        <w:spacing w:line="360" w:lineRule="auto"/>
         <w:jc w:val="both"/>
         <w:rPr>
           <w:rFonts w:ascii="Arial" w:cs="Arial" w:eastAsia="Arial" w:hAnsi="Arial"/>
@@ -598,6 +613,7 @@
           <w:tcPr/>
           <w:p>
             <w:pPr>
+              <w:spacing w:line="360" w:lineRule="auto"/>
               <w:jc w:val="both"/>
               <w:rPr>
                 <w:rFonts w:ascii="Arial" w:cs="Arial" w:eastAsia="Arial" w:hAnsi="Arial"/>
@@ -613,6 +629,7 @@
           </w:p>
           <w:p>
             <w:pPr>
+              <w:spacing w:line="360" w:lineRule="auto"/>
               <w:jc w:val="both"/>
               <w:rPr>
                 <w:rFonts w:ascii="Arial" w:cs="Arial" w:eastAsia="Arial" w:hAnsi="Arial"/>
@@ -628,6 +645,7 @@
           </w:p>
           <w:p>
             <w:pPr>
+              <w:spacing w:line="360" w:lineRule="auto"/>
               <w:jc w:val="both"/>
               <w:rPr>
                 <w:rFonts w:ascii="Arial" w:cs="Arial" w:eastAsia="Arial" w:hAnsi="Arial"/>
@@ -643,6 +661,7 @@
           </w:p>
           <w:p>
             <w:pPr>
+              <w:spacing w:line="360" w:lineRule="auto"/>
               <w:jc w:val="both"/>
               <w:rPr>
                 <w:rFonts w:ascii="Arial" w:cs="Arial" w:eastAsia="Arial" w:hAnsi="Arial"/>
@@ -658,6 +677,7 @@
           </w:p>
           <w:p>
             <w:pPr>
+              <w:spacing w:line="360" w:lineRule="auto"/>
               <w:jc w:val="both"/>
               <w:rPr>
                 <w:rFonts w:ascii="Arial" w:cs="Arial" w:eastAsia="Arial" w:hAnsi="Arial"/>
@@ -673,6 +693,7 @@
           </w:p>
           <w:p>
             <w:pPr>
+              <w:spacing w:line="360" w:lineRule="auto"/>
               <w:jc w:val="both"/>
               <w:rPr>
                 <w:rFonts w:ascii="Arial" w:cs="Arial" w:eastAsia="Arial" w:hAnsi="Arial"/>
@@ -688,6 +709,7 @@
           </w:p>
           <w:p>
             <w:pPr>
+              <w:spacing w:line="360" w:lineRule="auto"/>
               <w:jc w:val="both"/>
               <w:rPr>
                 <w:rFonts w:ascii="Arial" w:cs="Arial" w:eastAsia="Arial" w:hAnsi="Arial"/>
@@ -703,6 +725,7 @@
           </w:p>
           <w:p>
             <w:pPr>
+              <w:spacing w:line="360" w:lineRule="auto"/>
               <w:jc w:val="both"/>
               <w:rPr>
                 <w:rFonts w:ascii="Arial" w:cs="Arial" w:eastAsia="Arial" w:hAnsi="Arial"/>
@@ -718,6 +741,7 @@
           </w:p>
           <w:p>
             <w:pPr>
+              <w:spacing w:line="360" w:lineRule="auto"/>
               <w:jc w:val="both"/>
               <w:rPr>
                 <w:rFonts w:ascii="Arial" w:cs="Arial" w:eastAsia="Arial" w:hAnsi="Arial"/>
@@ -736,6 +760,7 @@
     </w:tbl>
     <w:p>
       <w:pPr>
+        <w:spacing w:line="360" w:lineRule="auto"/>
         <w:jc w:val="center"/>
         <w:rPr>
           <w:rFonts w:ascii="Arial" w:cs="Arial" w:eastAsia="Arial" w:hAnsi="Arial"/>
@@ -758,7 +783,7 @@
     </w:p>
     <w:p>
       <w:pPr>
-        <w:spacing w:after="120" w:lineRule="auto"/>
+        <w:spacing w:after="120" w:line="360" w:lineRule="auto"/>
         <w:jc w:val="both"/>
         <w:rPr>
           <w:rFonts w:ascii="Arial" w:cs="Arial" w:eastAsia="Arial" w:hAnsi="Arial"/>
@@ -774,7 +799,7 @@
     </w:p>
     <w:p>
       <w:pPr>
-        <w:spacing w:after="120" w:lineRule="auto"/>
+        <w:spacing w:after="120" w:line="360" w:lineRule="auto"/>
         <w:jc w:val="both"/>
         <w:rPr>
           <w:rFonts w:ascii="Arial" w:cs="Arial" w:eastAsia="Arial" w:hAnsi="Arial"/>
@@ -791,6 +816,7 @@
     <w:p>
       <w:pPr>
         <w:pStyle w:val="Heading3"/>
+        <w:spacing w:line="360" w:lineRule="auto"/>
         <w:jc w:val="both"/>
         <w:rPr>
           <w:rFonts w:ascii="Arial" w:cs="Arial" w:eastAsia="Arial" w:hAnsi="Arial"/>
@@ -843,6 +869,7 @@
           <w:tcPr/>
           <w:p>
             <w:pPr>
+              <w:spacing w:line="360" w:lineRule="auto"/>
               <w:jc w:val="both"/>
               <w:rPr>
                 <w:rFonts w:ascii="Arial" w:cs="Arial" w:eastAsia="Arial" w:hAnsi="Arial"/>
@@ -858,6 +885,7 @@
           </w:p>
           <w:p>
             <w:pPr>
+              <w:spacing w:line="360" w:lineRule="auto"/>
               <w:jc w:val="both"/>
               <w:rPr>
                 <w:rFonts w:ascii="Arial" w:cs="Arial" w:eastAsia="Arial" w:hAnsi="Arial"/>
@@ -873,6 +901,7 @@
           </w:p>
           <w:p>
             <w:pPr>
+              <w:spacing w:line="360" w:lineRule="auto"/>
               <w:jc w:val="both"/>
               <w:rPr>
                 <w:rFonts w:ascii="Arial" w:cs="Arial" w:eastAsia="Arial" w:hAnsi="Arial"/>
@@ -888,6 +917,7 @@
           </w:p>
           <w:p>
             <w:pPr>
+              <w:spacing w:line="360" w:lineRule="auto"/>
               <w:jc w:val="both"/>
               <w:rPr>
                 <w:rFonts w:ascii="Arial" w:cs="Arial" w:eastAsia="Arial" w:hAnsi="Arial"/>
@@ -903,6 +933,7 @@
           </w:p>
           <w:p>
             <w:pPr>
+              <w:spacing w:line="360" w:lineRule="auto"/>
               <w:jc w:val="both"/>
               <w:rPr>
                 <w:rFonts w:ascii="Arial" w:cs="Arial" w:eastAsia="Arial" w:hAnsi="Arial"/>
@@ -918,6 +949,7 @@
           </w:p>
           <w:p>
             <w:pPr>
+              <w:spacing w:line="360" w:lineRule="auto"/>
               <w:jc w:val="both"/>
               <w:rPr>
                 <w:rFonts w:ascii="Arial" w:cs="Arial" w:eastAsia="Arial" w:hAnsi="Arial"/>
@@ -933,6 +965,7 @@
           </w:p>
           <w:p>
             <w:pPr>
+              <w:spacing w:line="360" w:lineRule="auto"/>
               <w:jc w:val="both"/>
               <w:rPr>
                 <w:rFonts w:ascii="Arial" w:cs="Arial" w:eastAsia="Arial" w:hAnsi="Arial"/>
@@ -948,6 +981,7 @@
           </w:p>
           <w:p>
             <w:pPr>
+              <w:spacing w:line="360" w:lineRule="auto"/>
               <w:jc w:val="both"/>
               <w:rPr>
                 <w:rFonts w:ascii="Arial" w:cs="Arial" w:eastAsia="Arial" w:hAnsi="Arial"/>
@@ -963,6 +997,7 @@
           </w:p>
           <w:p>
             <w:pPr>
+              <w:spacing w:line="360" w:lineRule="auto"/>
               <w:jc w:val="both"/>
               <w:rPr>
                 <w:rFonts w:ascii="Arial" w:cs="Arial" w:eastAsia="Arial" w:hAnsi="Arial"/>
@@ -978,6 +1013,7 @@
           </w:p>
           <w:p>
             <w:pPr>
+              <w:spacing w:line="360" w:lineRule="auto"/>
               <w:jc w:val="both"/>
               <w:rPr>
                 <w:rFonts w:ascii="Arial" w:cs="Arial" w:eastAsia="Arial" w:hAnsi="Arial"/>
@@ -996,6 +1032,7 @@
     </w:tbl>
     <w:p>
       <w:pPr>
+        <w:spacing w:line="360" w:lineRule="auto"/>
         <w:jc w:val="center"/>
         <w:rPr>
           <w:rFonts w:ascii="Arial" w:cs="Arial" w:eastAsia="Arial" w:hAnsi="Arial"/>
@@ -1018,7 +1055,7 @@
     </w:p>
     <w:p>
       <w:pPr>
-        <w:spacing w:after="120" w:lineRule="auto"/>
+        <w:spacing w:after="120" w:line="360" w:lineRule="auto"/>
         <w:jc w:val="both"/>
         <w:rPr>
           <w:rFonts w:ascii="Arial" w:cs="Arial" w:eastAsia="Arial" w:hAnsi="Arial"/>
@@ -1034,7 +1071,7 @@
     </w:p>
     <w:p>
       <w:pPr>
-        <w:spacing w:after="120" w:lineRule="auto"/>
+        <w:spacing w:after="120" w:line="360" w:lineRule="auto"/>
         <w:jc w:val="both"/>
         <w:rPr>
           <w:rFonts w:ascii="Arial" w:cs="Arial" w:eastAsia="Arial" w:hAnsi="Arial"/>
@@ -1050,7 +1087,7 @@
     </w:p>
     <w:p>
       <w:pPr>
-        <w:spacing w:after="120" w:lineRule="auto"/>
+        <w:spacing w:after="120" w:line="360" w:lineRule="auto"/>
         <w:ind w:left="480" w:firstLine="0"/>
         <w:jc w:val="both"/>
         <w:rPr>
@@ -1076,7 +1113,7 @@
     </w:p>
     <w:p>
       <w:pPr>
-        <w:spacing w:after="120" w:lineRule="auto"/>
+        <w:spacing w:after="120" w:line="360" w:lineRule="auto"/>
         <w:jc w:val="both"/>
         <w:rPr>
           <w:rFonts w:ascii="Arial" w:cs="Arial" w:eastAsia="Arial" w:hAnsi="Arial"/>
@@ -1093,6 +1130,7 @@
     <w:p>
       <w:pPr>
         <w:pStyle w:val="Heading3"/>
+        <w:spacing w:line="360" w:lineRule="auto"/>
         <w:jc w:val="both"/>
         <w:rPr>
           <w:rFonts w:ascii="Arial" w:cs="Arial" w:eastAsia="Arial" w:hAnsi="Arial"/>
@@ -1145,6 +1183,7 @@
           <w:tcPr/>
           <w:p>
             <w:pPr>
+              <w:spacing w:line="360" w:lineRule="auto"/>
               <w:jc w:val="both"/>
               <w:rPr>
                 <w:rFonts w:ascii="Arial" w:cs="Arial" w:eastAsia="Arial" w:hAnsi="Arial"/>
@@ -1160,6 +1199,7 @@
           </w:p>
           <w:p>
             <w:pPr>
+              <w:spacing w:line="360" w:lineRule="auto"/>
               <w:jc w:val="both"/>
               <w:rPr>
                 <w:rFonts w:ascii="Arial" w:cs="Arial" w:eastAsia="Arial" w:hAnsi="Arial"/>
@@ -1175,6 +1215,7 @@
           </w:p>
           <w:p>
             <w:pPr>
+              <w:spacing w:line="360" w:lineRule="auto"/>
               <w:jc w:val="both"/>
               <w:rPr>
                 <w:rFonts w:ascii="Arial" w:cs="Arial" w:eastAsia="Arial" w:hAnsi="Arial"/>
@@ -1190,6 +1231,7 @@
           </w:p>
           <w:p>
             <w:pPr>
+              <w:spacing w:line="360" w:lineRule="auto"/>
               <w:jc w:val="both"/>
               <w:rPr>
                 <w:rFonts w:ascii="Arial" w:cs="Arial" w:eastAsia="Arial" w:hAnsi="Arial"/>
@@ -1205,6 +1247,7 @@
           </w:p>
           <w:p>
             <w:pPr>
+              <w:spacing w:line="360" w:lineRule="auto"/>
               <w:jc w:val="both"/>
               <w:rPr>
                 <w:rFonts w:ascii="Arial" w:cs="Arial" w:eastAsia="Arial" w:hAnsi="Arial"/>
@@ -1220,6 +1263,7 @@
           </w:p>
           <w:p>
             <w:pPr>
+              <w:spacing w:line="360" w:lineRule="auto"/>
               <w:jc w:val="both"/>
               <w:rPr>
                 <w:rFonts w:ascii="Arial" w:cs="Arial" w:eastAsia="Arial" w:hAnsi="Arial"/>
@@ -1235,6 +1279,7 @@
           </w:p>
           <w:p>
             <w:pPr>
+              <w:spacing w:line="360" w:lineRule="auto"/>
               <w:jc w:val="both"/>
               <w:rPr>
                 <w:rFonts w:ascii="Arial" w:cs="Arial" w:eastAsia="Arial" w:hAnsi="Arial"/>
@@ -1250,6 +1295,7 @@
           </w:p>
           <w:p>
             <w:pPr>
+              <w:spacing w:line="360" w:lineRule="auto"/>
               <w:jc w:val="both"/>
               <w:rPr>
                 <w:rFonts w:ascii="Arial" w:cs="Arial" w:eastAsia="Arial" w:hAnsi="Arial"/>
@@ -1265,6 +1311,7 @@
           </w:p>
           <w:p>
             <w:pPr>
+              <w:spacing w:line="360" w:lineRule="auto"/>
               <w:jc w:val="both"/>
               <w:rPr>
                 <w:rFonts w:ascii="Arial" w:cs="Arial" w:eastAsia="Arial" w:hAnsi="Arial"/>
@@ -1280,6 +1327,7 @@
           </w:p>
           <w:p>
             <w:pPr>
+              <w:spacing w:line="360" w:lineRule="auto"/>
               <w:jc w:val="both"/>
               <w:rPr>
                 <w:rFonts w:ascii="Arial" w:cs="Arial" w:eastAsia="Arial" w:hAnsi="Arial"/>
@@ -1295,6 +1343,7 @@
           </w:p>
           <w:p>
             <w:pPr>
+              <w:spacing w:line="360" w:lineRule="auto"/>
               <w:jc w:val="both"/>
               <w:rPr>
                 <w:rFonts w:ascii="Arial" w:cs="Arial" w:eastAsia="Arial" w:hAnsi="Arial"/>
@@ -1310,6 +1359,7 @@
           </w:p>
           <w:p>
             <w:pPr>
+              <w:spacing w:line="360" w:lineRule="auto"/>
               <w:jc w:val="both"/>
               <w:rPr>
                 <w:rFonts w:ascii="Arial" w:cs="Arial" w:eastAsia="Arial" w:hAnsi="Arial"/>
@@ -1325,6 +1375,7 @@
           </w:p>
           <w:p>
             <w:pPr>
+              <w:spacing w:line="360" w:lineRule="auto"/>
               <w:jc w:val="both"/>
               <w:rPr>
                 <w:rFonts w:ascii="Arial" w:cs="Arial" w:eastAsia="Arial" w:hAnsi="Arial"/>
@@ -1340,6 +1391,7 @@
           </w:p>
           <w:p>
             <w:pPr>
+              <w:spacing w:line="360" w:lineRule="auto"/>
               <w:jc w:val="both"/>
               <w:rPr>
                 <w:rFonts w:ascii="Arial" w:cs="Arial" w:eastAsia="Arial" w:hAnsi="Arial"/>
@@ -1355,6 +1407,7 @@
           </w:p>
           <w:p>
             <w:pPr>
+              <w:spacing w:line="360" w:lineRule="auto"/>
               <w:jc w:val="both"/>
               <w:rPr>
                 <w:rFonts w:ascii="Arial" w:cs="Arial" w:eastAsia="Arial" w:hAnsi="Arial"/>
@@ -1370,6 +1423,7 @@
           </w:p>
           <w:p>
             <w:pPr>
+              <w:spacing w:line="360" w:lineRule="auto"/>
               <w:jc w:val="both"/>
               <w:rPr>
                 <w:rFonts w:ascii="Arial" w:cs="Arial" w:eastAsia="Arial" w:hAnsi="Arial"/>
@@ -1385,6 +1439,7 @@
           </w:p>
           <w:p>
             <w:pPr>
+              <w:spacing w:line="360" w:lineRule="auto"/>
               <w:jc w:val="both"/>
               <w:rPr>
                 <w:rFonts w:ascii="Arial" w:cs="Arial" w:eastAsia="Arial" w:hAnsi="Arial"/>
@@ -1400,6 +1455,7 @@
           </w:p>
           <w:p>
             <w:pPr>
+              <w:spacing w:line="360" w:lineRule="auto"/>
               <w:jc w:val="both"/>
               <w:rPr>
                 <w:rFonts w:ascii="Arial" w:cs="Arial" w:eastAsia="Arial" w:hAnsi="Arial"/>
@@ -1415,6 +1471,7 @@
           </w:p>
           <w:p>
             <w:pPr>
+              <w:spacing w:line="360" w:lineRule="auto"/>
               <w:jc w:val="both"/>
               <w:rPr>
                 <w:rFonts w:ascii="Arial" w:cs="Arial" w:eastAsia="Arial" w:hAnsi="Arial"/>
@@ -1430,6 +1487,7 @@
           </w:p>
           <w:p>
             <w:pPr>
+              <w:spacing w:line="360" w:lineRule="auto"/>
               <w:jc w:val="both"/>
               <w:rPr>
                 <w:rFonts w:ascii="Arial" w:cs="Arial" w:eastAsia="Arial" w:hAnsi="Arial"/>
@@ -1445,6 +1503,7 @@
           </w:p>
           <w:p>
             <w:pPr>
+              <w:spacing w:line="360" w:lineRule="auto"/>
               <w:jc w:val="both"/>
               <w:rPr>
                 <w:rFonts w:ascii="Arial" w:cs="Arial" w:eastAsia="Arial" w:hAnsi="Arial"/>
@@ -1460,6 +1519,7 @@
           </w:p>
           <w:p>
             <w:pPr>
+              <w:spacing w:line="360" w:lineRule="auto"/>
               <w:jc w:val="both"/>
               <w:rPr>
                 <w:rFonts w:ascii="Arial" w:cs="Arial" w:eastAsia="Arial" w:hAnsi="Arial"/>
@@ -1475,6 +1535,7 @@
           </w:p>
           <w:p>
             <w:pPr>
+              <w:spacing w:line="360" w:lineRule="auto"/>
               <w:jc w:val="both"/>
               <w:rPr>
                 <w:rFonts w:ascii="Arial" w:cs="Arial" w:eastAsia="Arial" w:hAnsi="Arial"/>
@@ -1490,6 +1551,7 @@
           </w:p>
           <w:p>
             <w:pPr>
+              <w:spacing w:line="360" w:lineRule="auto"/>
               <w:jc w:val="both"/>
               <w:rPr>
                 <w:rFonts w:ascii="Arial" w:cs="Arial" w:eastAsia="Arial" w:hAnsi="Arial"/>
@@ -1505,6 +1567,7 @@
           </w:p>
           <w:p>
             <w:pPr>
+              <w:spacing w:line="360" w:lineRule="auto"/>
               <w:jc w:val="both"/>
               <w:rPr>
                 <w:rFonts w:ascii="Arial" w:cs="Arial" w:eastAsia="Arial" w:hAnsi="Arial"/>
@@ -1523,6 +1586,7 @@
     </w:tbl>
     <w:p>
       <w:pPr>
+        <w:spacing w:line="360" w:lineRule="auto"/>
         <w:jc w:val="center"/>
         <w:rPr>
           <w:rFonts w:ascii="Arial" w:cs="Arial" w:eastAsia="Arial" w:hAnsi="Arial"/>
@@ -1545,7 +1609,7 @@
     </w:p>
     <w:p>
       <w:pPr>
-        <w:spacing w:after="120" w:lineRule="auto"/>
+        <w:spacing w:after="120" w:line="360" w:lineRule="auto"/>
         <w:jc w:val="both"/>
         <w:rPr>
           <w:rFonts w:ascii="Arial" w:cs="Arial" w:eastAsia="Arial" w:hAnsi="Arial"/>
@@ -1597,6 +1661,7 @@
           <w:tcPr/>
           <w:p>
             <w:pPr>
+              <w:spacing w:line="360" w:lineRule="auto"/>
               <w:jc w:val="both"/>
               <w:rPr>
                 <w:rFonts w:ascii="Arial" w:cs="Arial" w:eastAsia="Arial" w:hAnsi="Arial"/>
@@ -1622,6 +1687,7 @@
           <w:tcPr/>
           <w:p>
             <w:pPr>
+              <w:spacing w:line="360" w:lineRule="auto"/>
               <w:jc w:val="both"/>
               <w:rPr>
                 <w:rFonts w:ascii="Arial" w:cs="Arial" w:eastAsia="Arial" w:hAnsi="Arial"/>
@@ -1647,6 +1713,7 @@
           <w:tcPr/>
           <w:p>
             <w:pPr>
+              <w:spacing w:line="360" w:lineRule="auto"/>
               <w:jc w:val="both"/>
               <w:rPr>
                 <w:rFonts w:ascii="Arial" w:cs="Arial" w:eastAsia="Arial" w:hAnsi="Arial"/>
@@ -1678,6 +1745,7 @@
           <w:tcPr/>
           <w:p>
             <w:pPr>
+              <w:spacing w:line="360" w:lineRule="auto"/>
               <w:jc w:val="both"/>
               <w:rPr>
                 <w:rFonts w:ascii="Arial" w:cs="Arial" w:eastAsia="Arial" w:hAnsi="Arial"/>
@@ -1696,6 +1764,7 @@
           <w:tcPr/>
           <w:p>
             <w:pPr>
+              <w:spacing w:line="360" w:lineRule="auto"/>
               <w:jc w:val="both"/>
               <w:rPr>
                 <w:rFonts w:ascii="Arial" w:cs="Arial" w:eastAsia="Arial" w:hAnsi="Arial"/>
@@ -1714,6 +1783,7 @@
           <w:tcPr/>
           <w:p>
             <w:pPr>
+              <w:spacing w:line="360" w:lineRule="auto"/>
               <w:jc w:val="both"/>
               <w:rPr>
                 <w:rFonts w:ascii="Arial" w:cs="Arial" w:eastAsia="Arial" w:hAnsi="Arial"/>
@@ -1738,6 +1808,7 @@
           <w:tcPr/>
           <w:p>
             <w:pPr>
+              <w:spacing w:line="360" w:lineRule="auto"/>
               <w:jc w:val="both"/>
               <w:rPr>
                 <w:rFonts w:ascii="Arial" w:cs="Arial" w:eastAsia="Arial" w:hAnsi="Arial"/>
@@ -1756,6 +1827,7 @@
           <w:tcPr/>
           <w:p>
             <w:pPr>
+              <w:spacing w:line="360" w:lineRule="auto"/>
               <w:jc w:val="both"/>
               <w:rPr>
                 <w:rFonts w:ascii="Arial" w:cs="Arial" w:eastAsia="Arial" w:hAnsi="Arial"/>
@@ -1774,6 +1846,7 @@
           <w:tcPr/>
           <w:p>
             <w:pPr>
+              <w:spacing w:line="360" w:lineRule="auto"/>
               <w:jc w:val="both"/>
               <w:rPr>
                 <w:rFonts w:ascii="Arial" w:cs="Arial" w:eastAsia="Arial" w:hAnsi="Arial"/>
@@ -1798,6 +1871,7 @@
           <w:tcPr/>
           <w:p>
             <w:pPr>
+              <w:spacing w:line="360" w:lineRule="auto"/>
               <w:jc w:val="both"/>
               <w:rPr>
                 <w:rFonts w:ascii="Arial" w:cs="Arial" w:eastAsia="Arial" w:hAnsi="Arial"/>
@@ -1816,6 +1890,7 @@
           <w:tcPr/>
           <w:p>
             <w:pPr>
+              <w:spacing w:line="360" w:lineRule="auto"/>
               <w:jc w:val="both"/>
               <w:rPr>
                 <w:rFonts w:ascii="Arial" w:cs="Arial" w:eastAsia="Arial" w:hAnsi="Arial"/>
@@ -1834,6 +1909,7 @@
           <w:tcPr/>
           <w:p>
             <w:pPr>
+              <w:spacing w:line="360" w:lineRule="auto"/>
               <w:jc w:val="both"/>
               <w:rPr>
                 <w:rFonts w:ascii="Arial" w:cs="Arial" w:eastAsia="Arial" w:hAnsi="Arial"/>
@@ -1858,6 +1934,7 @@
           <w:tcPr/>
           <w:p>
             <w:pPr>
+              <w:spacing w:line="360" w:lineRule="auto"/>
               <w:jc w:val="both"/>
               <w:rPr>
                 <w:rFonts w:ascii="Arial" w:cs="Arial" w:eastAsia="Arial" w:hAnsi="Arial"/>
@@ -1876,6 +1953,7 @@
           <w:tcPr/>
           <w:p>
             <w:pPr>
+              <w:spacing w:line="360" w:lineRule="auto"/>
               <w:jc w:val="both"/>
               <w:rPr>
                 <w:rFonts w:ascii="Arial" w:cs="Arial" w:eastAsia="Arial" w:hAnsi="Arial"/>
@@ -1894,6 +1972,7 @@
           <w:tcPr/>
           <w:p>
             <w:pPr>
+              <w:spacing w:line="360" w:lineRule="auto"/>
               <w:jc w:val="both"/>
               <w:rPr>
                 <w:rFonts w:ascii="Arial" w:cs="Arial" w:eastAsia="Arial" w:hAnsi="Arial"/>
@@ -1912,7 +1991,7 @@
     </w:tbl>
     <w:p>
       <w:pPr>
-        <w:spacing w:after="120" w:lineRule="auto"/>
+        <w:spacing w:after="120" w:line="360" w:lineRule="auto"/>
         <w:jc w:val="both"/>
         <w:rPr>
           <w:rFonts w:ascii="Arial" w:cs="Arial" w:eastAsia="Arial" w:hAnsi="Arial"/>
@@ -1926,7 +2005,7 @@
     </w:p>
     <w:p>
       <w:pPr>
-        <w:spacing w:after="120" w:lineRule="auto"/>
+        <w:spacing w:after="120" w:line="360" w:lineRule="auto"/>
         <w:jc w:val="both"/>
         <w:rPr>
           <w:rFonts w:ascii="Arial" w:cs="Arial" w:eastAsia="Arial" w:hAnsi="Arial"/>
@@ -1942,7 +2021,7 @@
     </w:p>
     <w:p>
       <w:pPr>
-        <w:spacing w:after="120" w:lineRule="auto"/>
+        <w:spacing w:after="120" w:line="360" w:lineRule="auto"/>
         <w:ind w:left="480" w:firstLine="0"/>
         <w:jc w:val="both"/>
         <w:rPr>
@@ -1968,7 +2047,7 @@
     </w:p>
     <w:p>
       <w:pPr>
-        <w:spacing w:after="120" w:lineRule="auto"/>
+        <w:spacing w:after="120" w:line="360" w:lineRule="auto"/>
         <w:jc w:val="both"/>
         <w:rPr>
           <w:rFonts w:ascii="Arial" w:cs="Arial" w:eastAsia="Arial" w:hAnsi="Arial"/>
@@ -1984,7 +2063,7 @@
     </w:p>
     <w:p>
       <w:pPr>
-        <w:spacing w:after="120" w:lineRule="auto"/>
+        <w:spacing w:after="120" w:line="360" w:lineRule="auto"/>
         <w:jc w:val="both"/>
         <w:rPr>
           <w:rFonts w:ascii="Arial" w:cs="Arial" w:eastAsia="Arial" w:hAnsi="Arial"/>
@@ -2001,6 +2080,7 @@
     <w:p>
       <w:pPr>
         <w:pStyle w:val="Heading2"/>
+        <w:spacing w:line="360" w:lineRule="auto"/>
         <w:jc w:val="both"/>
         <w:rPr>
           <w:rFonts w:ascii="Arial" w:cs="Arial" w:eastAsia="Arial" w:hAnsi="Arial"/>
@@ -2053,6 +2133,7 @@
           <w:tcPr/>
           <w:p>
             <w:pPr>
+              <w:spacing w:line="360" w:lineRule="auto"/>
               <w:jc w:val="both"/>
               <w:rPr>
                 <w:rFonts w:ascii="Arial" w:cs="Arial" w:eastAsia="Arial" w:hAnsi="Arial"/>
@@ -2068,6 +2149,7 @@
           </w:p>
           <w:p>
             <w:pPr>
+              <w:spacing w:line="360" w:lineRule="auto"/>
               <w:jc w:val="both"/>
               <w:rPr>
                 <w:rFonts w:ascii="Arial" w:cs="Arial" w:eastAsia="Arial" w:hAnsi="Arial"/>
@@ -2083,6 +2165,7 @@
           </w:p>
           <w:p>
             <w:pPr>
+              <w:spacing w:line="360" w:lineRule="auto"/>
               <w:jc w:val="both"/>
               <w:rPr>
                 <w:rFonts w:ascii="Arial" w:cs="Arial" w:eastAsia="Arial" w:hAnsi="Arial"/>
@@ -2101,6 +2184,7 @@
     </w:tbl>
     <w:p>
       <w:pPr>
+        <w:spacing w:line="360" w:lineRule="auto"/>
         <w:jc w:val="center"/>
         <w:rPr>
           <w:rFonts w:ascii="Arial" w:cs="Arial" w:eastAsia="Arial" w:hAnsi="Arial"/>
@@ -2123,7 +2207,7 @@
     </w:p>
     <w:p>
       <w:pPr>
-        <w:spacing w:after="120" w:lineRule="auto"/>
+        <w:spacing w:after="120" w:line="360" w:lineRule="auto"/>
         <w:jc w:val="both"/>
         <w:rPr>
           <w:rFonts w:ascii="Arial" w:cs="Arial" w:eastAsia="Arial" w:hAnsi="Arial"/>
@@ -2139,7 +2223,7 @@
     </w:p>
     <w:p>
       <w:pPr>
-        <w:spacing w:after="120" w:lineRule="auto"/>
+        <w:spacing w:after="120" w:line="360" w:lineRule="auto"/>
         <w:jc w:val="both"/>
         <w:rPr>
           <w:rFonts w:ascii="Arial" w:cs="Arial" w:eastAsia="Arial" w:hAnsi="Arial"/>
@@ -2156,6 +2240,7 @@
     <w:p>
       <w:pPr>
         <w:pStyle w:val="Heading2"/>
+        <w:spacing w:line="360" w:lineRule="auto"/>
         <w:jc w:val="both"/>
         <w:rPr>
           <w:rFonts w:ascii="Arial" w:cs="Arial" w:eastAsia="Arial" w:hAnsi="Arial"/>
@@ -2177,7 +2262,7 @@
     </w:p>
     <w:p>
       <w:pPr>
-        <w:spacing w:after="120" w:lineRule="auto"/>
+        <w:spacing w:after="120" w:line="360" w:lineRule="auto"/>
         <w:jc w:val="both"/>
         <w:rPr>
           <w:rFonts w:ascii="Arial" w:cs="Arial" w:eastAsia="Arial" w:hAnsi="Arial"/>
@@ -2229,6 +2314,7 @@
           <w:tcPr/>
           <w:p>
             <w:pPr>
+              <w:spacing w:line="360" w:lineRule="auto"/>
               <w:jc w:val="both"/>
               <w:rPr>
                 <w:rFonts w:ascii="Arial" w:cs="Arial" w:eastAsia="Arial" w:hAnsi="Arial"/>
@@ -2254,6 +2340,7 @@
           <w:tcPr/>
           <w:p>
             <w:pPr>
+              <w:spacing w:line="360" w:lineRule="auto"/>
               <w:jc w:val="both"/>
               <w:rPr>
                 <w:rFonts w:ascii="Arial" w:cs="Arial" w:eastAsia="Arial" w:hAnsi="Arial"/>
@@ -2279,6 +2366,7 @@
           <w:tcPr/>
           <w:p>
             <w:pPr>
+              <w:spacing w:line="360" w:lineRule="auto"/>
               <w:jc w:val="both"/>
               <w:rPr>
                 <w:rFonts w:ascii="Arial" w:cs="Arial" w:eastAsia="Arial" w:hAnsi="Arial"/>
@@ -2310,6 +2398,7 @@
           <w:tcPr/>
           <w:p>
             <w:pPr>
+              <w:spacing w:line="360" w:lineRule="auto"/>
               <w:jc w:val="both"/>
               <w:rPr>
                 <w:rFonts w:ascii="Arial" w:cs="Arial" w:eastAsia="Arial" w:hAnsi="Arial"/>
@@ -2328,6 +2417,7 @@
           <w:tcPr/>
           <w:p>
             <w:pPr>
+              <w:spacing w:line="360" w:lineRule="auto"/>
               <w:jc w:val="both"/>
               <w:rPr>
                 <w:rFonts w:ascii="Arial" w:cs="Arial" w:eastAsia="Arial" w:hAnsi="Arial"/>
@@ -2346,6 +2436,7 @@
           <w:tcPr/>
           <w:p>
             <w:pPr>
+              <w:spacing w:line="360" w:lineRule="auto"/>
               <w:jc w:val="both"/>
               <w:rPr>
                 <w:rFonts w:ascii="Arial" w:cs="Arial" w:eastAsia="Arial" w:hAnsi="Arial"/>
@@ -2370,6 +2461,7 @@
           <w:tcPr/>
           <w:p>
             <w:pPr>
+              <w:spacing w:line="360" w:lineRule="auto"/>
               <w:jc w:val="both"/>
               <w:rPr>
                 <w:rFonts w:ascii="Arial" w:cs="Arial" w:eastAsia="Arial" w:hAnsi="Arial"/>
@@ -2388,6 +2480,7 @@
           <w:tcPr/>
           <w:p>
             <w:pPr>
+              <w:spacing w:line="360" w:lineRule="auto"/>
               <w:jc w:val="both"/>
               <w:rPr>
                 <w:rFonts w:ascii="Arial" w:cs="Arial" w:eastAsia="Arial" w:hAnsi="Arial"/>
@@ -2406,6 +2499,7 @@
           <w:tcPr/>
           <w:p>
             <w:pPr>
+              <w:spacing w:line="360" w:lineRule="auto"/>
               <w:jc w:val="both"/>
               <w:rPr>
                 <w:rFonts w:ascii="Arial" w:cs="Arial" w:eastAsia="Arial" w:hAnsi="Arial"/>
@@ -2424,7 +2518,7 @@
     </w:tbl>
     <w:p>
       <w:pPr>
-        <w:spacing w:after="120" w:lineRule="auto"/>
+        <w:spacing w:after="120" w:line="360" w:lineRule="auto"/>
         <w:jc w:val="both"/>
         <w:rPr>
           <w:rFonts w:ascii="Arial" w:cs="Arial" w:eastAsia="Arial" w:hAnsi="Arial"/>
@@ -2438,7 +2532,7 @@
     </w:p>
     <w:p>
       <w:pPr>
-        <w:spacing w:after="120" w:lineRule="auto"/>
+        <w:spacing w:after="120" w:line="360" w:lineRule="auto"/>
         <w:jc w:val="both"/>
         <w:rPr>
           <w:rFonts w:ascii="Arial" w:cs="Arial" w:eastAsia="Arial" w:hAnsi="Arial"/>
@@ -2454,7 +2548,7 @@
     </w:p>
     <w:p>
       <w:pPr>
-        <w:spacing w:after="120" w:lineRule="auto"/>
+        <w:spacing w:after="120" w:line="360" w:lineRule="auto"/>
         <w:jc w:val="both"/>
         <w:rPr>
           <w:rFonts w:ascii="Arial" w:cs="Arial" w:eastAsia="Arial" w:hAnsi="Arial"/>
@@ -2470,7 +2564,7 @@
     </w:p>
     <w:p>
       <w:pPr>
-        <w:spacing w:after="120" w:lineRule="auto"/>
+        <w:spacing w:after="120" w:line="360" w:lineRule="auto"/>
         <w:jc w:val="both"/>
         <w:rPr>
           <w:rFonts w:ascii="Arial" w:cs="Arial" w:eastAsia="Arial" w:hAnsi="Arial"/>
@@ -2486,7 +2580,7 @@
     </w:p>
     <w:p>
       <w:pPr>
-        <w:spacing w:after="120" w:lineRule="auto"/>
+        <w:spacing w:after="120" w:line="360" w:lineRule="auto"/>
         <w:jc w:val="both"/>
         <w:rPr>
           <w:rFonts w:ascii="Arial" w:cs="Arial" w:eastAsia="Arial" w:hAnsi="Arial"/>
@@ -2502,7 +2596,7 @@
     </w:p>
     <w:p>
       <w:pPr>
-        <w:spacing w:after="120" w:lineRule="auto"/>
+        <w:spacing w:after="120" w:line="360" w:lineRule="auto"/>
         <w:jc w:val="both"/>
         <w:rPr>
           <w:rFonts w:ascii="Arial" w:cs="Arial" w:eastAsia="Arial" w:hAnsi="Arial"/>
@@ -2517,10 +2611,11 @@
     <w:p>
       <w:pPr>
         <w:pStyle w:val="Heading2"/>
-        <w:spacing w:after="120" w:lineRule="auto"/>
+        <w:spacing w:after="120" w:line="360" w:lineRule="auto"/>
         <w:jc w:val="both"/>
         <w:rPr>
           <w:rFonts w:ascii="Arial" w:cs="Arial" w:eastAsia="Arial" w:hAnsi="Arial"/>
+          <w:color w:val="000000"/>
           <w:sz w:val="24"/>
           <w:szCs w:val="24"/>
         </w:rPr>
@@ -2528,6 +2623,7 @@
       <w:r>
         <w:rPr>
           <w:rFonts w:ascii="Arial" w:cs="Arial" w:eastAsia="Arial" w:hAnsi="Arial"/>
+          <w:color w:val="000000"/>
           <w:rtl w:val="0"/>
         </w:rPr>
         <w:t xml:space="preserve">2.5 Método pesquisar </w:t>
@@ -2571,6 +2667,7 @@
           <w:tcPr/>
           <w:p>
             <w:pPr>
+              <w:spacing w:line="360" w:lineRule="auto"/>
               <w:jc w:val="both"/>
               <w:rPr>
                 <w:rFonts w:ascii="Arial" w:cs="Arial" w:eastAsia="Arial" w:hAnsi="Arial"/>
@@ -2586,6 +2683,7 @@
           </w:p>
           <w:p>
             <w:pPr>
+              <w:spacing w:line="360" w:lineRule="auto"/>
               <w:jc w:val="both"/>
               <w:rPr>
                 <w:rFonts w:ascii="Arial" w:cs="Arial" w:eastAsia="Arial" w:hAnsi="Arial"/>
@@ -2601,6 +2699,7 @@
           </w:p>
           <w:p>
             <w:pPr>
+              <w:spacing w:line="360" w:lineRule="auto"/>
               <w:jc w:val="both"/>
               <w:rPr>
                 <w:rFonts w:ascii="Arial" w:cs="Arial" w:eastAsia="Arial" w:hAnsi="Arial"/>
@@ -2616,6 +2715,7 @@
           </w:p>
           <w:p>
             <w:pPr>
+              <w:spacing w:line="360" w:lineRule="auto"/>
               <w:jc w:val="both"/>
               <w:rPr>
                 <w:rFonts w:ascii="Arial" w:cs="Arial" w:eastAsia="Arial" w:hAnsi="Arial"/>
@@ -2631,6 +2731,7 @@
           </w:p>
           <w:p>
             <w:pPr>
+              <w:spacing w:line="360" w:lineRule="auto"/>
               <w:jc w:val="both"/>
               <w:rPr>
                 <w:rFonts w:ascii="Arial" w:cs="Arial" w:eastAsia="Arial" w:hAnsi="Arial"/>
@@ -2646,6 +2747,7 @@
           </w:p>
           <w:p>
             <w:pPr>
+              <w:spacing w:line="360" w:lineRule="auto"/>
               <w:jc w:val="both"/>
               <w:rPr>
                 <w:rFonts w:ascii="Arial" w:cs="Arial" w:eastAsia="Arial" w:hAnsi="Arial"/>
@@ -2661,6 +2763,7 @@
           </w:p>
           <w:p>
             <w:pPr>
+              <w:spacing w:line="360" w:lineRule="auto"/>
               <w:jc w:val="both"/>
               <w:rPr>
                 <w:rFonts w:ascii="Arial" w:cs="Arial" w:eastAsia="Arial" w:hAnsi="Arial"/>
@@ -2676,6 +2779,7 @@
           </w:p>
           <w:p>
             <w:pPr>
+              <w:spacing w:line="360" w:lineRule="auto"/>
               <w:jc w:val="both"/>
               <w:rPr>
                 <w:rFonts w:ascii="Arial" w:cs="Arial" w:eastAsia="Arial" w:hAnsi="Arial"/>
@@ -2691,6 +2795,7 @@
           </w:p>
           <w:p>
             <w:pPr>
+              <w:spacing w:line="360" w:lineRule="auto"/>
               <w:jc w:val="both"/>
               <w:rPr>
                 <w:rFonts w:ascii="Arial" w:cs="Arial" w:eastAsia="Arial" w:hAnsi="Arial"/>
@@ -2706,6 +2811,7 @@
           </w:p>
           <w:p>
             <w:pPr>
+              <w:spacing w:line="360" w:lineRule="auto"/>
               <w:jc w:val="both"/>
               <w:rPr>
                 <w:rFonts w:ascii="Arial" w:cs="Arial" w:eastAsia="Arial" w:hAnsi="Arial"/>
@@ -2721,6 +2827,7 @@
           </w:p>
           <w:p>
             <w:pPr>
+              <w:spacing w:line="360" w:lineRule="auto"/>
               <w:jc w:val="both"/>
               <w:rPr>
                 <w:rFonts w:ascii="Arial" w:cs="Arial" w:eastAsia="Arial" w:hAnsi="Arial"/>
@@ -2736,6 +2843,7 @@
           </w:p>
           <w:p>
             <w:pPr>
+              <w:spacing w:line="360" w:lineRule="auto"/>
               <w:jc w:val="both"/>
               <w:rPr>
                 <w:rFonts w:ascii="Arial" w:cs="Arial" w:eastAsia="Arial" w:hAnsi="Arial"/>
@@ -2751,6 +2859,7 @@
           </w:p>
           <w:p>
             <w:pPr>
+              <w:spacing w:line="360" w:lineRule="auto"/>
               <w:jc w:val="both"/>
               <w:rPr>
                 <w:rFonts w:ascii="Arial" w:cs="Arial" w:eastAsia="Arial" w:hAnsi="Arial"/>
@@ -2766,6 +2875,7 @@
           </w:p>
           <w:p>
             <w:pPr>
+              <w:spacing w:line="360" w:lineRule="auto"/>
               <w:jc w:val="both"/>
               <w:rPr>
                 <w:rFonts w:ascii="Arial" w:cs="Arial" w:eastAsia="Arial" w:hAnsi="Arial"/>
@@ -2781,6 +2891,7 @@
           </w:p>
           <w:p>
             <w:pPr>
+              <w:spacing w:line="360" w:lineRule="auto"/>
               <w:jc w:val="both"/>
               <w:rPr>
                 <w:rFonts w:ascii="Arial" w:cs="Arial" w:eastAsia="Arial" w:hAnsi="Arial"/>
@@ -2796,6 +2907,7 @@
           </w:p>
           <w:p>
             <w:pPr>
+              <w:spacing w:line="360" w:lineRule="auto"/>
               <w:jc w:val="both"/>
               <w:rPr>
                 <w:rFonts w:ascii="Arial" w:cs="Arial" w:eastAsia="Arial" w:hAnsi="Arial"/>
@@ -2811,6 +2923,7 @@
           </w:p>
           <w:p>
             <w:pPr>
+              <w:spacing w:line="360" w:lineRule="auto"/>
               <w:jc w:val="both"/>
               <w:rPr>
                 <w:rFonts w:ascii="Arial" w:cs="Arial" w:eastAsia="Arial" w:hAnsi="Arial"/>
@@ -2829,6 +2942,7 @@
     </w:tbl>
     <w:p>
       <w:pPr>
+        <w:spacing w:line="360" w:lineRule="auto"/>
         <w:jc w:val="center"/>
         <w:rPr>
           <w:rFonts w:ascii="Arial" w:cs="Arial" w:eastAsia="Arial" w:hAnsi="Arial"/>
@@ -2848,6 +2962,7 @@
     </w:p>
     <w:p>
       <w:pPr>
+        <w:spacing w:line="360" w:lineRule="auto"/>
         <w:jc w:val="both"/>
         <w:rPr>
           <w:rFonts w:ascii="Arial" w:cs="Arial" w:eastAsia="Arial" w:hAnsi="Arial"/>
@@ -2863,6 +2978,7 @@
     </w:p>
     <w:p>
       <w:pPr>
+        <w:spacing w:line="360" w:lineRule="auto"/>
         <w:jc w:val="both"/>
         <w:rPr>
           <w:rFonts w:ascii="Arial" w:cs="Arial" w:eastAsia="Arial" w:hAnsi="Arial"/>
@@ -2928,7 +3044,7 @@
           </w:tcPr>
           <w:p>
             <w:pPr>
-              <w:spacing w:after="0" w:line="240" w:lineRule="auto"/>
+              <w:spacing w:after="0" w:line="360" w:lineRule="auto"/>
               <w:jc w:val="both"/>
               <w:rPr>
                 <w:rFonts w:ascii="Arial" w:cs="Arial" w:eastAsia="Arial" w:hAnsi="Arial"/>
@@ -2965,7 +3081,7 @@
           </w:tcPr>
           <w:p>
             <w:pPr>
-              <w:spacing w:after="0" w:line="240" w:lineRule="auto"/>
+              <w:spacing w:after="0" w:line="360" w:lineRule="auto"/>
               <w:jc w:val="both"/>
               <w:rPr>
                 <w:rFonts w:ascii="Arial" w:cs="Arial" w:eastAsia="Arial" w:hAnsi="Arial"/>
@@ -3002,7 +3118,7 @@
           </w:tcPr>
           <w:p>
             <w:pPr>
-              <w:spacing w:after="0" w:line="240" w:lineRule="auto"/>
+              <w:spacing w:after="0" w:line="360" w:lineRule="auto"/>
               <w:jc w:val="both"/>
               <w:rPr>
                 <w:rFonts w:ascii="Arial" w:cs="Arial" w:eastAsia="Arial" w:hAnsi="Arial"/>
@@ -3045,7 +3161,7 @@
           </w:tcPr>
           <w:p>
             <w:pPr>
-              <w:spacing w:after="0" w:line="240" w:lineRule="auto"/>
+              <w:spacing w:after="0" w:line="360" w:lineRule="auto"/>
               <w:jc w:val="both"/>
               <w:rPr>
                 <w:rFonts w:ascii="Arial" w:cs="Arial" w:eastAsia="Arial" w:hAnsi="Arial"/>
@@ -3078,7 +3194,7 @@
           </w:tcPr>
           <w:p>
             <w:pPr>
-              <w:spacing w:after="0" w:line="240" w:lineRule="auto"/>
+              <w:spacing w:after="0" w:line="360" w:lineRule="auto"/>
               <w:jc w:val="both"/>
               <w:rPr>
                 <w:rFonts w:ascii="Arial" w:cs="Arial" w:eastAsia="Arial" w:hAnsi="Arial"/>
@@ -3111,7 +3227,7 @@
           </w:tcPr>
           <w:p>
             <w:pPr>
-              <w:spacing w:after="0" w:line="240" w:lineRule="auto"/>
+              <w:spacing w:after="0" w:line="360" w:lineRule="auto"/>
               <w:jc w:val="both"/>
               <w:rPr>
                 <w:rFonts w:ascii="Arial" w:cs="Arial" w:eastAsia="Arial" w:hAnsi="Arial"/>
@@ -3150,7 +3266,7 @@
           </w:tcPr>
           <w:p>
             <w:pPr>
-              <w:spacing w:after="0" w:line="240" w:lineRule="auto"/>
+              <w:spacing w:after="0" w:line="360" w:lineRule="auto"/>
               <w:jc w:val="both"/>
               <w:rPr>
                 <w:rFonts w:ascii="Arial" w:cs="Arial" w:eastAsia="Arial" w:hAnsi="Arial"/>
@@ -3183,7 +3299,7 @@
           </w:tcPr>
           <w:p>
             <w:pPr>
-              <w:spacing w:after="0" w:line="240" w:lineRule="auto"/>
+              <w:spacing w:after="0" w:line="360" w:lineRule="auto"/>
               <w:jc w:val="both"/>
               <w:rPr>
                 <w:rFonts w:ascii="Arial" w:cs="Arial" w:eastAsia="Arial" w:hAnsi="Arial"/>
@@ -3216,7 +3332,7 @@
           </w:tcPr>
           <w:p>
             <w:pPr>
-              <w:spacing w:after="0" w:line="240" w:lineRule="auto"/>
+              <w:spacing w:after="0" w:line="360" w:lineRule="auto"/>
               <w:jc w:val="both"/>
               <w:rPr>
                 <w:rFonts w:ascii="Arial" w:cs="Arial" w:eastAsia="Arial" w:hAnsi="Arial"/>
@@ -3255,7 +3371,7 @@
           </w:tcPr>
           <w:p>
             <w:pPr>
-              <w:spacing w:after="0" w:line="240" w:lineRule="auto"/>
+              <w:spacing w:after="0" w:line="360" w:lineRule="auto"/>
               <w:jc w:val="both"/>
               <w:rPr>
                 <w:rFonts w:ascii="Arial" w:cs="Arial" w:eastAsia="Arial" w:hAnsi="Arial"/>
@@ -3288,7 +3404,7 @@
           </w:tcPr>
           <w:p>
             <w:pPr>
-              <w:spacing w:after="0" w:line="240" w:lineRule="auto"/>
+              <w:spacing w:after="0" w:line="360" w:lineRule="auto"/>
               <w:jc w:val="both"/>
               <w:rPr>
                 <w:rFonts w:ascii="Arial" w:cs="Arial" w:eastAsia="Arial" w:hAnsi="Arial"/>
@@ -3321,7 +3437,7 @@
           </w:tcPr>
           <w:p>
             <w:pPr>
-              <w:spacing w:after="0" w:line="240" w:lineRule="auto"/>
+              <w:spacing w:after="0" w:line="360" w:lineRule="auto"/>
               <w:jc w:val="both"/>
               <w:rPr>
                 <w:rFonts w:ascii="Arial" w:cs="Arial" w:eastAsia="Arial" w:hAnsi="Arial"/>
@@ -3360,7 +3476,7 @@
           </w:tcPr>
           <w:p>
             <w:pPr>
-              <w:spacing w:after="0" w:line="240" w:lineRule="auto"/>
+              <w:spacing w:after="0" w:line="360" w:lineRule="auto"/>
               <w:jc w:val="both"/>
               <w:rPr>
                 <w:rFonts w:ascii="Arial" w:cs="Arial" w:eastAsia="Arial" w:hAnsi="Arial"/>
@@ -3393,7 +3509,7 @@
           </w:tcPr>
           <w:p>
             <w:pPr>
-              <w:spacing w:after="0" w:line="240" w:lineRule="auto"/>
+              <w:spacing w:after="0" w:line="360" w:lineRule="auto"/>
               <w:jc w:val="both"/>
               <w:rPr>
                 <w:rFonts w:ascii="Arial" w:cs="Arial" w:eastAsia="Arial" w:hAnsi="Arial"/>
@@ -3426,7 +3542,7 @@
           </w:tcPr>
           <w:p>
             <w:pPr>
-              <w:spacing w:after="0" w:line="240" w:lineRule="auto"/>
+              <w:spacing w:after="0" w:line="360" w:lineRule="auto"/>
               <w:jc w:val="both"/>
               <w:rPr>
                 <w:rFonts w:ascii="Arial" w:cs="Arial" w:eastAsia="Arial" w:hAnsi="Arial"/>
@@ -3465,7 +3581,7 @@
           </w:tcPr>
           <w:p>
             <w:pPr>
-              <w:spacing w:after="0" w:line="240" w:lineRule="auto"/>
+              <w:spacing w:after="0" w:line="360" w:lineRule="auto"/>
               <w:jc w:val="both"/>
               <w:rPr>
                 <w:rFonts w:ascii="Arial" w:cs="Arial" w:eastAsia="Arial" w:hAnsi="Arial"/>
@@ -3498,7 +3614,7 @@
           </w:tcPr>
           <w:p>
             <w:pPr>
-              <w:spacing w:after="0" w:line="240" w:lineRule="auto"/>
+              <w:spacing w:after="0" w:line="360" w:lineRule="auto"/>
               <w:jc w:val="both"/>
               <w:rPr>
                 <w:rFonts w:ascii="Arial" w:cs="Arial" w:eastAsia="Arial" w:hAnsi="Arial"/>
@@ -3531,7 +3647,7 @@
           </w:tcPr>
           <w:p>
             <w:pPr>
-              <w:spacing w:after="0" w:line="240" w:lineRule="auto"/>
+              <w:spacing w:after="0" w:line="360" w:lineRule="auto"/>
               <w:jc w:val="both"/>
               <w:rPr>
                 <w:rFonts w:ascii="Arial" w:cs="Arial" w:eastAsia="Arial" w:hAnsi="Arial"/>
@@ -3550,6 +3666,7 @@
     </w:tbl>
     <w:p>
       <w:pPr>
+        <w:spacing w:line="360" w:lineRule="auto"/>
         <w:jc w:val="both"/>
         <w:rPr>
           <w:rFonts w:ascii="Arial" w:cs="Arial" w:eastAsia="Arial" w:hAnsi="Arial"/>
@@ -3563,7 +3680,7 @@
     </w:p>
     <w:p>
       <w:pPr>
-        <w:spacing w:after="240" w:lineRule="auto"/>
+        <w:spacing w:after="240" w:line="360" w:lineRule="auto"/>
         <w:jc w:val="both"/>
         <w:rPr>
           <w:rFonts w:ascii="Arial" w:cs="Arial" w:eastAsia="Arial" w:hAnsi="Arial"/>
@@ -3640,7 +3757,7 @@
     </w:p>
     <w:p>
       <w:pPr>
-        <w:spacing w:after="240" w:lineRule="auto"/>
+        <w:spacing w:after="240" w:line="360" w:lineRule="auto"/>
         <w:jc w:val="both"/>
         <w:rPr>
           <w:rFonts w:ascii="Arial" w:cs="Arial" w:eastAsia="Arial" w:hAnsi="Arial"/>
@@ -3660,7 +3777,7 @@
     </w:p>
     <w:p>
       <w:pPr>
-        <w:spacing w:after="240" w:lineRule="auto"/>
+        <w:spacing w:after="240" w:line="360" w:lineRule="auto"/>
         <w:jc w:val="both"/>
         <w:rPr>
           <w:rFonts w:ascii="Arial" w:cs="Arial" w:eastAsia="Arial" w:hAnsi="Arial"/>
@@ -3708,7 +3825,7 @@
     </w:p>
     <w:p>
       <w:pPr>
-        <w:spacing w:after="240" w:lineRule="auto"/>
+        <w:spacing w:after="240" w:line="360" w:lineRule="auto"/>
         <w:jc w:val="both"/>
         <w:rPr>
           <w:rFonts w:ascii="Arial" w:cs="Arial" w:eastAsia="Arial" w:hAnsi="Arial"/>
@@ -3728,7 +3845,7 @@
     </w:p>
     <w:p>
       <w:pPr>
-        <w:spacing w:after="240" w:lineRule="auto"/>
+        <w:spacing w:after="240" w:line="360" w:lineRule="auto"/>
         <w:jc w:val="both"/>
         <w:rPr>
           <w:rFonts w:ascii="Arial" w:cs="Arial" w:eastAsia="Arial" w:hAnsi="Arial"/>
@@ -3740,40 +3857,24 @@
           <w:rtl w:val="0"/>
         </w:rPr>
         <w:t xml:space="preserve">Matematicamente, ambas são O(n). O que muda é que a lista ordenada possui uma "válvula de escape" na linha 11. Se estivermos procurando o nome "Carlos" e o ponteiro chegar em "Daniel", a lista ordenada sabe que o "Carlos" não está mais para frente (comp &gt; 0), abortando o laço mais cedo. A lista não ordenada, por não ter garantia de onde os itens estão, precisaria ir até o final. Isso não muda a ordem de complexidade (pois no pior caso de procurar o "Zico", a ordenada também vai até o final), mas na prática deixa a busca de itens inexistentes mais rápida.</w:t>
-        <w:br w:type="textWrapping"/>
-        <w:br w:type="textWrapping"/>
-      </w:r>
-      <w:r>
-        <w:rPr>
-          <w:rFonts w:ascii="Arial" w:cs="Arial" w:eastAsia="Arial" w:hAnsi="Arial"/>
-          <w:b w:val="1"/>
-          <w:bCs w:val="1"/>
+      </w:r>
+    </w:p>
+    <w:p>
+      <w:pPr>
+        <w:pStyle w:val="Heading2"/>
+        <w:spacing w:after="120" w:line="360" w:lineRule="auto"/>
+        <w:jc w:val="both"/>
+        <w:rPr>
+          <w:rFonts w:ascii="Arial" w:cs="Arial" w:eastAsia="Arial" w:hAnsi="Arial"/>
+          <w:color w:val="000000"/>
           <w:sz w:val="24"/>
           <w:szCs w:val="24"/>
-          <w:rtl w:val="0"/>
-        </w:rPr>
-        <w:t xml:space="preserve">2.6 Método remover</w:t>
-      </w:r>
-      <w:r>
-        <w:rPr>
-          <w:rtl w:val="0"/>
-        </w:rPr>
-      </w:r>
-    </w:p>
-    <w:p>
-      <w:pPr>
-        <w:pStyle w:val="Heading2"/>
-        <w:spacing w:after="120" w:lineRule="auto"/>
-        <w:jc w:val="both"/>
-        <w:rPr>
-          <w:rFonts w:ascii="Arial" w:cs="Arial" w:eastAsia="Arial" w:hAnsi="Arial"/>
-          <w:sz w:val="24"/>
-          <w:szCs w:val="24"/>
-        </w:rPr>
-      </w:pPr>
-      <w:r>
-        <w:rPr>
-          <w:rFonts w:ascii="Arial" w:cs="Arial" w:eastAsia="Arial" w:hAnsi="Arial"/>
+        </w:rPr>
+      </w:pPr>
+      <w:r>
+        <w:rPr>
+          <w:rFonts w:ascii="Arial" w:cs="Arial" w:eastAsia="Arial" w:hAnsi="Arial"/>
+          <w:color w:val="000000"/>
           <w:rtl w:val="0"/>
         </w:rPr>
         <w:t xml:space="preserve">2.6 Método remover</w:t>
@@ -3817,6 +3918,7 @@
           <w:tcPr/>
           <w:p>
             <w:pPr>
+              <w:spacing w:line="360" w:lineRule="auto"/>
               <w:jc w:val="both"/>
               <w:rPr>
                 <w:rFonts w:ascii="Arial" w:cs="Arial" w:eastAsia="Arial" w:hAnsi="Arial"/>
@@ -3832,6 +3934,7 @@
           </w:p>
           <w:p>
             <w:pPr>
+              <w:spacing w:line="360" w:lineRule="auto"/>
               <w:jc w:val="both"/>
               <w:rPr>
                 <w:rFonts w:ascii="Arial" w:cs="Arial" w:eastAsia="Arial" w:hAnsi="Arial"/>
@@ -3847,6 +3950,7 @@
           </w:p>
           <w:p>
             <w:pPr>
+              <w:spacing w:line="360" w:lineRule="auto"/>
               <w:jc w:val="both"/>
               <w:rPr>
                 <w:rFonts w:ascii="Arial" w:cs="Arial" w:eastAsia="Arial" w:hAnsi="Arial"/>
@@ -3862,6 +3966,7 @@
           </w:p>
           <w:p>
             <w:pPr>
+              <w:spacing w:line="360" w:lineRule="auto"/>
               <w:jc w:val="both"/>
               <w:rPr>
                 <w:rFonts w:ascii="Arial" w:cs="Arial" w:eastAsia="Arial" w:hAnsi="Arial"/>
@@ -3877,6 +3982,7 @@
           </w:p>
           <w:p>
             <w:pPr>
+              <w:spacing w:line="360" w:lineRule="auto"/>
               <w:jc w:val="both"/>
               <w:rPr>
                 <w:rFonts w:ascii="Arial" w:cs="Arial" w:eastAsia="Arial" w:hAnsi="Arial"/>
@@ -3892,6 +3998,7 @@
           </w:p>
           <w:p>
             <w:pPr>
+              <w:spacing w:line="360" w:lineRule="auto"/>
               <w:jc w:val="both"/>
               <w:rPr>
                 <w:rFonts w:ascii="Arial" w:cs="Arial" w:eastAsia="Arial" w:hAnsi="Arial"/>
@@ -3907,6 +4014,7 @@
           </w:p>
           <w:p>
             <w:pPr>
+              <w:spacing w:line="360" w:lineRule="auto"/>
               <w:jc w:val="both"/>
               <w:rPr>
                 <w:rFonts w:ascii="Arial" w:cs="Arial" w:eastAsia="Arial" w:hAnsi="Arial"/>
@@ -3922,6 +4030,7 @@
           </w:p>
           <w:p>
             <w:pPr>
+              <w:spacing w:line="360" w:lineRule="auto"/>
               <w:jc w:val="both"/>
               <w:rPr>
                 <w:rFonts w:ascii="Arial" w:cs="Arial" w:eastAsia="Arial" w:hAnsi="Arial"/>
@@ -3937,6 +4046,7 @@
           </w:p>
           <w:p>
             <w:pPr>
+              <w:spacing w:line="360" w:lineRule="auto"/>
               <w:jc w:val="both"/>
               <w:rPr>
                 <w:rFonts w:ascii="Arial" w:cs="Arial" w:eastAsia="Arial" w:hAnsi="Arial"/>
@@ -3952,6 +4062,7 @@
           </w:p>
           <w:p>
             <w:pPr>
+              <w:spacing w:line="360" w:lineRule="auto"/>
               <w:jc w:val="both"/>
               <w:rPr>
                 <w:rFonts w:ascii="Arial" w:cs="Arial" w:eastAsia="Arial" w:hAnsi="Arial"/>
@@ -3967,6 +4078,7 @@
           </w:p>
           <w:p>
             <w:pPr>
+              <w:spacing w:line="360" w:lineRule="auto"/>
               <w:jc w:val="both"/>
               <w:rPr>
                 <w:rFonts w:ascii="Arial" w:cs="Arial" w:eastAsia="Arial" w:hAnsi="Arial"/>
@@ -3982,6 +4094,7 @@
           </w:p>
           <w:p>
             <w:pPr>
+              <w:spacing w:line="360" w:lineRule="auto"/>
               <w:jc w:val="both"/>
               <w:rPr>
                 <w:rFonts w:ascii="Arial" w:cs="Arial" w:eastAsia="Arial" w:hAnsi="Arial"/>
@@ -3997,6 +4110,7 @@
           </w:p>
           <w:p>
             <w:pPr>
+              <w:spacing w:line="360" w:lineRule="auto"/>
               <w:jc w:val="both"/>
               <w:rPr>
                 <w:rFonts w:ascii="Arial" w:cs="Arial" w:eastAsia="Arial" w:hAnsi="Arial"/>
@@ -4012,6 +4126,7 @@
           </w:p>
           <w:p>
             <w:pPr>
+              <w:spacing w:line="360" w:lineRule="auto"/>
               <w:jc w:val="both"/>
               <w:rPr>
                 <w:rFonts w:ascii="Arial" w:cs="Arial" w:eastAsia="Arial" w:hAnsi="Arial"/>
@@ -4027,6 +4142,7 @@
           </w:p>
           <w:p>
             <w:pPr>
+              <w:spacing w:line="360" w:lineRule="auto"/>
               <w:jc w:val="both"/>
               <w:rPr>
                 <w:rFonts w:ascii="Arial" w:cs="Arial" w:eastAsia="Arial" w:hAnsi="Arial"/>
@@ -4042,6 +4158,7 @@
           </w:p>
           <w:p>
             <w:pPr>
+              <w:spacing w:line="360" w:lineRule="auto"/>
               <w:jc w:val="both"/>
               <w:rPr>
                 <w:rFonts w:ascii="Arial" w:cs="Arial" w:eastAsia="Arial" w:hAnsi="Arial"/>
@@ -4057,6 +4174,7 @@
           </w:p>
           <w:p>
             <w:pPr>
+              <w:spacing w:line="360" w:lineRule="auto"/>
               <w:jc w:val="both"/>
               <w:rPr>
                 <w:rFonts w:ascii="Arial" w:cs="Arial" w:eastAsia="Arial" w:hAnsi="Arial"/>
@@ -4072,6 +4190,7 @@
           </w:p>
           <w:p>
             <w:pPr>
+              <w:spacing w:line="360" w:lineRule="auto"/>
               <w:jc w:val="both"/>
               <w:rPr>
                 <w:rFonts w:ascii="Arial" w:cs="Arial" w:eastAsia="Arial" w:hAnsi="Arial"/>
@@ -4087,6 +4206,7 @@
           </w:p>
           <w:p>
             <w:pPr>
+              <w:spacing w:line="360" w:lineRule="auto"/>
               <w:jc w:val="both"/>
               <w:rPr>
                 <w:rFonts w:ascii="Arial" w:cs="Arial" w:eastAsia="Arial" w:hAnsi="Arial"/>
@@ -4102,6 +4222,7 @@
           </w:p>
           <w:p>
             <w:pPr>
+              <w:spacing w:line="360" w:lineRule="auto"/>
               <w:jc w:val="both"/>
               <w:rPr>
                 <w:rFonts w:ascii="Arial" w:cs="Arial" w:eastAsia="Arial" w:hAnsi="Arial"/>
@@ -4117,6 +4238,7 @@
           </w:p>
           <w:p>
             <w:pPr>
+              <w:spacing w:line="360" w:lineRule="auto"/>
               <w:jc w:val="both"/>
               <w:rPr>
                 <w:rFonts w:ascii="Arial" w:cs="Arial" w:eastAsia="Arial" w:hAnsi="Arial"/>
@@ -4132,6 +4254,7 @@
           </w:p>
           <w:p>
             <w:pPr>
+              <w:spacing w:line="360" w:lineRule="auto"/>
               <w:jc w:val="both"/>
               <w:rPr>
                 <w:rFonts w:ascii="Arial" w:cs="Arial" w:eastAsia="Arial" w:hAnsi="Arial"/>
@@ -4147,6 +4270,7 @@
           </w:p>
           <w:p>
             <w:pPr>
+              <w:spacing w:line="360" w:lineRule="auto"/>
               <w:jc w:val="both"/>
               <w:rPr>
                 <w:rFonts w:ascii="Arial" w:cs="Arial" w:eastAsia="Arial" w:hAnsi="Arial"/>
@@ -4162,6 +4286,7 @@
           </w:p>
           <w:p>
             <w:pPr>
+              <w:spacing w:line="360" w:lineRule="auto"/>
               <w:jc w:val="both"/>
               <w:rPr>
                 <w:rFonts w:ascii="Arial" w:cs="Arial" w:eastAsia="Arial" w:hAnsi="Arial"/>
@@ -4177,6 +4302,7 @@
           </w:p>
           <w:p>
             <w:pPr>
+              <w:spacing w:line="360" w:lineRule="auto"/>
               <w:jc w:val="both"/>
               <w:rPr>
                 <w:rFonts w:ascii="Arial" w:cs="Arial" w:eastAsia="Arial" w:hAnsi="Arial"/>
@@ -4192,6 +4318,7 @@
           </w:p>
           <w:p>
             <w:pPr>
+              <w:spacing w:line="360" w:lineRule="auto"/>
               <w:jc w:val="both"/>
               <w:rPr>
                 <w:rFonts w:ascii="Arial" w:cs="Arial" w:eastAsia="Arial" w:hAnsi="Arial"/>
@@ -4207,6 +4334,7 @@
           </w:p>
           <w:p>
             <w:pPr>
+              <w:spacing w:line="360" w:lineRule="auto"/>
               <w:jc w:val="both"/>
               <w:rPr>
                 <w:rFonts w:ascii="Arial" w:cs="Arial" w:eastAsia="Arial" w:hAnsi="Arial"/>
@@ -4222,6 +4350,7 @@
           </w:p>
           <w:p>
             <w:pPr>
+              <w:spacing w:line="360" w:lineRule="auto"/>
               <w:jc w:val="both"/>
               <w:rPr>
                 <w:rFonts w:ascii="Arial" w:cs="Arial" w:eastAsia="Arial" w:hAnsi="Arial"/>
@@ -4237,6 +4366,7 @@
           </w:p>
           <w:p>
             <w:pPr>
+              <w:spacing w:line="360" w:lineRule="auto"/>
               <w:jc w:val="both"/>
               <w:rPr>
                 <w:rFonts w:ascii="Arial" w:cs="Arial" w:eastAsia="Arial" w:hAnsi="Arial"/>
@@ -4252,6 +4382,7 @@
           </w:p>
           <w:p>
             <w:pPr>
+              <w:spacing w:line="360" w:lineRule="auto"/>
               <w:jc w:val="both"/>
               <w:rPr>
                 <w:rFonts w:ascii="Arial" w:cs="Arial" w:eastAsia="Arial" w:hAnsi="Arial"/>
@@ -4267,6 +4398,7 @@
           </w:p>
           <w:p>
             <w:pPr>
+              <w:spacing w:line="360" w:lineRule="auto"/>
               <w:jc w:val="both"/>
               <w:rPr>
                 <w:rFonts w:ascii="Arial" w:cs="Arial" w:eastAsia="Arial" w:hAnsi="Arial"/>
@@ -4282,6 +4414,7 @@
           </w:p>
           <w:p>
             <w:pPr>
+              <w:spacing w:line="360" w:lineRule="auto"/>
               <w:jc w:val="both"/>
               <w:rPr>
                 <w:rFonts w:ascii="Arial" w:cs="Arial" w:eastAsia="Arial" w:hAnsi="Arial"/>
@@ -4297,6 +4430,7 @@
           </w:p>
           <w:p>
             <w:pPr>
+              <w:spacing w:line="360" w:lineRule="auto"/>
               <w:jc w:val="both"/>
               <w:rPr>
                 <w:rFonts w:ascii="Arial" w:cs="Arial" w:eastAsia="Arial" w:hAnsi="Arial"/>
@@ -4312,6 +4446,7 @@
           </w:p>
           <w:p>
             <w:pPr>
+              <w:spacing w:line="360" w:lineRule="auto"/>
               <w:jc w:val="both"/>
               <w:rPr>
                 <w:rFonts w:ascii="Arial" w:cs="Arial" w:eastAsia="Arial" w:hAnsi="Arial"/>
@@ -4327,6 +4462,7 @@
           </w:p>
           <w:p>
             <w:pPr>
+              <w:spacing w:line="360" w:lineRule="auto"/>
               <w:jc w:val="both"/>
               <w:rPr>
                 <w:rFonts w:ascii="Arial" w:cs="Arial" w:eastAsia="Arial" w:hAnsi="Arial"/>
@@ -4342,6 +4478,7 @@
           </w:p>
           <w:p>
             <w:pPr>
+              <w:spacing w:line="360" w:lineRule="auto"/>
               <w:jc w:val="both"/>
               <w:rPr>
                 <w:rFonts w:ascii="Arial" w:cs="Arial" w:eastAsia="Arial" w:hAnsi="Arial"/>
@@ -4357,6 +4494,7 @@
           </w:p>
           <w:p>
             <w:pPr>
+              <w:spacing w:line="360" w:lineRule="auto"/>
               <w:jc w:val="both"/>
               <w:rPr>
                 <w:rFonts w:ascii="Arial" w:cs="Arial" w:eastAsia="Arial" w:hAnsi="Arial"/>
@@ -4372,6 +4510,7 @@
           </w:p>
           <w:p>
             <w:pPr>
+              <w:spacing w:line="360" w:lineRule="auto"/>
               <w:jc w:val="both"/>
               <w:rPr>
                 <w:rFonts w:ascii="Arial" w:cs="Arial" w:eastAsia="Arial" w:hAnsi="Arial"/>
@@ -4387,6 +4526,7 @@
           </w:p>
           <w:p>
             <w:pPr>
+              <w:spacing w:line="360" w:lineRule="auto"/>
               <w:jc w:val="both"/>
               <w:rPr>
                 <w:rFonts w:ascii="Arial" w:cs="Arial" w:eastAsia="Arial" w:hAnsi="Arial"/>
@@ -4405,6 +4545,7 @@
     </w:tbl>
     <w:p>
       <w:pPr>
+        <w:spacing w:line="360" w:lineRule="auto"/>
         <w:jc w:val="center"/>
         <w:rPr>
           <w:rFonts w:ascii="Arial" w:cs="Arial" w:eastAsia="Arial" w:hAnsi="Arial"/>
@@ -4424,7 +4565,7 @@
     </w:p>
     <w:p>
       <w:pPr>
-        <w:spacing w:after="240" w:lineRule="auto"/>
+        <w:spacing w:after="240" w:line="360" w:lineRule="auto"/>
         <w:jc w:val="both"/>
         <w:rPr>
           <w:rFonts w:ascii="Arial" w:cs="Arial" w:eastAsia="Arial" w:hAnsi="Arial"/>
@@ -4440,7 +4581,7 @@
     </w:p>
     <w:p>
       <w:pPr>
-        <w:spacing w:after="240" w:lineRule="auto"/>
+        <w:spacing w:after="240" w:line="360" w:lineRule="auto"/>
         <w:jc w:val="both"/>
         <w:rPr>
           <w:rFonts w:ascii="Arial" w:cs="Arial" w:eastAsia="Arial" w:hAnsi="Arial"/>
@@ -4472,7 +4613,7 @@
     </w:p>
     <w:p>
       <w:pPr>
-        <w:spacing w:after="240" w:lineRule="auto"/>
+        <w:spacing w:after="240" w:line="360" w:lineRule="auto"/>
         <w:jc w:val="both"/>
         <w:rPr>
           <w:rFonts w:ascii="Arial" w:cs="Arial" w:eastAsia="Arial" w:hAnsi="Arial"/>
@@ -4504,7 +4645,7 @@
     </w:p>
     <w:p>
       <w:pPr>
-        <w:spacing w:after="240" w:lineRule="auto"/>
+        <w:spacing w:after="240" w:line="360" w:lineRule="auto"/>
         <w:jc w:val="both"/>
         <w:rPr>
           <w:rFonts w:ascii="Arial" w:cs="Arial" w:eastAsia="Arial" w:hAnsi="Arial"/>
@@ -4520,30 +4661,20 @@
     </w:p>
     <w:p>
       <w:pPr>
-        <w:rPr>
-          <w:rFonts w:ascii="Arial" w:cs="Arial" w:eastAsia="Arial" w:hAnsi="Arial"/>
-        </w:rPr>
-      </w:pPr>
-      <w:r>
-        <w:rPr>
-          <w:rtl w:val="0"/>
-        </w:rPr>
-      </w:r>
-    </w:p>
-    <w:p>
-      <w:pPr>
-        <w:rPr>
-          <w:rFonts w:ascii="Arial" w:cs="Arial" w:eastAsia="Arial" w:hAnsi="Arial"/>
-        </w:rPr>
-      </w:pPr>
-      <w:r>
-        <w:rPr>
-          <w:rtl w:val="0"/>
-        </w:rPr>
-      </w:r>
-    </w:p>
-    <w:p>
-      <w:pPr>
+        <w:spacing w:line="360" w:lineRule="auto"/>
+        <w:rPr>
+          <w:rFonts w:ascii="Arial" w:cs="Arial" w:eastAsia="Arial" w:hAnsi="Arial"/>
+        </w:rPr>
+      </w:pPr>
+      <w:r>
+        <w:rPr>
+          <w:rtl w:val="0"/>
+        </w:rPr>
+      </w:r>
+    </w:p>
+    <w:p>
+      <w:pPr>
+        <w:spacing w:line="360" w:lineRule="auto"/>
         <w:rPr>
           <w:rFonts w:ascii="Arial" w:cs="Arial" w:eastAsia="Arial" w:hAnsi="Arial"/>
           <w:b w:val="1"/>
@@ -4566,6 +4697,7 @@
     </w:p>
     <w:p>
       <w:pPr>
+        <w:spacing w:line="360" w:lineRule="auto"/>
         <w:rPr>
           <w:rFonts w:ascii="Arial" w:cs="Arial" w:eastAsia="Arial" w:hAnsi="Arial"/>
         </w:rPr>
@@ -4580,6 +4712,7 @@
     </w:p>
     <w:p>
       <w:pPr>
+        <w:spacing w:line="360" w:lineRule="auto"/>
         <w:jc w:val="both"/>
         <w:rPr>
           <w:rFonts w:ascii="Arial" w:cs="Arial" w:eastAsia="Arial" w:hAnsi="Arial"/>
@@ -4596,6 +4729,7 @@
     <w:p>
       <w:pPr>
         <w:pStyle w:val="Heading2"/>
+        <w:spacing w:line="360" w:lineRule="auto"/>
         <w:jc w:val="both"/>
         <w:rPr>
           <w:rFonts w:ascii="Arial" w:cs="Arial" w:eastAsia="Arial" w:hAnsi="Arial"/>
@@ -4613,6 +4747,7 @@
     </w:p>
     <w:p>
       <w:pPr>
+        <w:spacing w:line="360" w:lineRule="auto"/>
         <w:jc w:val="both"/>
         <w:rPr>
           <w:rFonts w:ascii="Arial" w:cs="Arial" w:eastAsia="Arial" w:hAnsi="Arial"/>
@@ -4669,6 +4804,7 @@
           </w:tcPr>
           <w:p>
             <w:pPr>
+              <w:spacing w:line="360" w:lineRule="auto"/>
               <w:jc w:val="center"/>
               <w:rPr/>
             </w:pPr>
@@ -4696,6 +4832,7 @@
           </w:tcPr>
           <w:p>
             <w:pPr>
+              <w:spacing w:line="360" w:lineRule="auto"/>
               <w:jc w:val="center"/>
               <w:rPr/>
             </w:pPr>
@@ -4723,6 +4860,7 @@
           </w:tcPr>
           <w:p>
             <w:pPr>
+              <w:spacing w:line="360" w:lineRule="auto"/>
               <w:jc w:val="center"/>
               <w:rPr/>
             </w:pPr>
@@ -4750,6 +4888,7 @@
           </w:tcPr>
           <w:p>
             <w:pPr>
+              <w:spacing w:line="360" w:lineRule="auto"/>
               <w:jc w:val="center"/>
               <w:rPr/>
             </w:pPr>
@@ -4777,6 +4916,7 @@
           </w:tcPr>
           <w:p>
             <w:pPr>
+              <w:spacing w:line="360" w:lineRule="auto"/>
               <w:jc w:val="center"/>
               <w:rPr/>
             </w:pPr>
@@ -4808,6 +4948,7 @@
           <w:tcPr/>
           <w:p>
             <w:pPr>
+              <w:spacing w:line="360" w:lineRule="auto"/>
               <w:jc w:val="center"/>
               <w:rPr/>
             </w:pPr>
@@ -4830,6 +4971,7 @@
           <w:tcPr/>
           <w:p>
             <w:pPr>
+              <w:spacing w:line="360" w:lineRule="auto"/>
               <w:jc w:val="center"/>
               <w:rPr/>
             </w:pPr>
@@ -4852,6 +4994,7 @@
           <w:tcPr/>
           <w:p>
             <w:pPr>
+              <w:spacing w:line="360" w:lineRule="auto"/>
               <w:jc w:val="center"/>
               <w:rPr/>
             </w:pPr>
@@ -4874,6 +5017,7 @@
           <w:tcPr/>
           <w:p>
             <w:pPr>
+              <w:spacing w:line="360" w:lineRule="auto"/>
               <w:jc w:val="center"/>
               <w:rPr/>
             </w:pPr>
@@ -4896,6 +5040,7 @@
           <w:tcPr/>
           <w:p>
             <w:pPr>
+              <w:spacing w:line="360" w:lineRule="auto"/>
               <w:jc w:val="center"/>
               <w:rPr/>
             </w:pPr>
@@ -4924,6 +5069,7 @@
           <w:tcPr/>
           <w:p>
             <w:pPr>
+              <w:spacing w:line="360" w:lineRule="auto"/>
               <w:jc w:val="center"/>
               <w:rPr/>
             </w:pPr>
@@ -4946,6 +5092,7 @@
           <w:tcPr/>
           <w:p>
             <w:pPr>
+              <w:spacing w:line="360" w:lineRule="auto"/>
               <w:jc w:val="center"/>
               <w:rPr/>
             </w:pPr>
@@ -4968,6 +5115,7 @@
           <w:tcPr/>
           <w:p>
             <w:pPr>
+              <w:spacing w:line="360" w:lineRule="auto"/>
               <w:jc w:val="center"/>
               <w:rPr/>
             </w:pPr>
@@ -4990,6 +5138,7 @@
           <w:tcPr/>
           <w:p>
             <w:pPr>
+              <w:spacing w:line="360" w:lineRule="auto"/>
               <w:jc w:val="center"/>
               <w:rPr/>
             </w:pPr>
@@ -5012,6 +5161,7 @@
           <w:tcPr/>
           <w:p>
             <w:pPr>
+              <w:spacing w:line="360" w:lineRule="auto"/>
               <w:jc w:val="center"/>
               <w:rPr/>
             </w:pPr>
@@ -5040,6 +5190,7 @@
           <w:tcPr/>
           <w:p>
             <w:pPr>
+              <w:spacing w:line="360" w:lineRule="auto"/>
               <w:jc w:val="center"/>
               <w:rPr/>
             </w:pPr>
@@ -5062,6 +5213,7 @@
           <w:tcPr/>
           <w:p>
             <w:pPr>
+              <w:spacing w:line="360" w:lineRule="auto"/>
               <w:jc w:val="center"/>
               <w:rPr/>
             </w:pPr>
@@ -5084,6 +5236,7 @@
           <w:tcPr/>
           <w:p>
             <w:pPr>
+              <w:spacing w:line="360" w:lineRule="auto"/>
               <w:jc w:val="center"/>
               <w:rPr/>
             </w:pPr>
@@ -5106,6 +5259,7 @@
           <w:tcPr/>
           <w:p>
             <w:pPr>
+              <w:spacing w:line="360" w:lineRule="auto"/>
               <w:jc w:val="center"/>
               <w:rPr/>
             </w:pPr>
@@ -5128,6 +5282,7 @@
           <w:tcPr/>
           <w:p>
             <w:pPr>
+              <w:spacing w:line="360" w:lineRule="auto"/>
               <w:jc w:val="center"/>
               <w:rPr/>
             </w:pPr>
@@ -5156,6 +5311,7 @@
           <w:tcPr/>
           <w:p>
             <w:pPr>
+              <w:spacing w:line="360" w:lineRule="auto"/>
               <w:jc w:val="center"/>
               <w:rPr/>
             </w:pPr>
@@ -5178,6 +5334,7 @@
           <w:tcPr/>
           <w:p>
             <w:pPr>
+              <w:spacing w:line="360" w:lineRule="auto"/>
               <w:jc w:val="center"/>
               <w:rPr/>
             </w:pPr>
@@ -5200,6 +5357,7 @@
           <w:tcPr/>
           <w:p>
             <w:pPr>
+              <w:spacing w:line="360" w:lineRule="auto"/>
               <w:jc w:val="center"/>
               <w:rPr/>
             </w:pPr>
@@ -5222,6 +5380,7 @@
           <w:tcPr/>
           <w:p>
             <w:pPr>
+              <w:spacing w:line="360" w:lineRule="auto"/>
               <w:jc w:val="center"/>
               <w:rPr/>
             </w:pPr>
@@ -5244,6 +5403,7 @@
           <w:tcPr/>
           <w:p>
             <w:pPr>
+              <w:spacing w:line="360" w:lineRule="auto"/>
               <w:jc w:val="center"/>
               <w:rPr/>
             </w:pPr>
@@ -5266,6 +5426,7 @@
     </w:tbl>
     <w:p>
       <w:pPr>
+        <w:spacing w:line="360" w:lineRule="auto"/>
         <w:jc w:val="center"/>
         <w:rPr>
           <w:rFonts w:ascii="Arial" w:cs="Arial" w:eastAsia="Arial" w:hAnsi="Arial"/>
@@ -5291,6 +5452,7 @@
     </w:p>
     <w:p>
       <w:pPr>
+        <w:spacing w:line="360" w:lineRule="auto"/>
         <w:jc w:val="center"/>
         <w:rPr>
           <w:rFonts w:ascii="Arial" w:cs="Arial" w:eastAsia="Arial" w:hAnsi="Arial"/>
@@ -5302,12 +5464,12 @@
           <wp:inline distB="0" distT="0" distL="114300" distR="114300">
             <wp:extent cx="5220000" cy="2958000"/>
             <wp:effectExtent b="0" l="0" r="0" t="0"/>
-            <wp:docPr id="2" name="image5.png"/>
+            <wp:docPr id="2" name="image1.png"/>
             <a:graphic>
               <a:graphicData uri="http://schemas.openxmlformats.org/drawingml/2006/picture">
                 <pic:pic>
                   <pic:nvPicPr>
-                    <pic:cNvPr id="0" name="image5.png"/>
+                    <pic:cNvPr id="0" name="image1.png"/>
                     <pic:cNvPicPr preferRelativeResize="0"/>
                   </pic:nvPicPr>
                   <pic:blipFill>
@@ -5339,6 +5501,7 @@
     </w:p>
     <w:p>
       <w:pPr>
+        <w:spacing w:line="360" w:lineRule="auto"/>
         <w:jc w:val="center"/>
         <w:rPr>
           <w:rFonts w:ascii="Arial" w:cs="Arial" w:eastAsia="Arial" w:hAnsi="Arial"/>
@@ -5364,6 +5527,7 @@
     </w:p>
     <w:p>
       <w:pPr>
+        <w:spacing w:line="360" w:lineRule="auto"/>
         <w:jc w:val="center"/>
         <w:rPr>
           <w:rFonts w:ascii="Arial" w:cs="Arial" w:eastAsia="Arial" w:hAnsi="Arial"/>
@@ -5412,6 +5576,7 @@
     </w:p>
     <w:p>
       <w:pPr>
+        <w:spacing w:line="360" w:lineRule="auto"/>
         <w:jc w:val="center"/>
         <w:rPr>
           <w:rFonts w:ascii="Arial" w:cs="Arial" w:eastAsia="Arial" w:hAnsi="Arial"/>
@@ -5437,6 +5602,7 @@
     </w:p>
     <w:p>
       <w:pPr>
+        <w:spacing w:line="360" w:lineRule="auto"/>
         <w:jc w:val="both"/>
         <w:rPr>
           <w:rFonts w:ascii="Arial" w:cs="Arial" w:eastAsia="Arial" w:hAnsi="Arial"/>
@@ -5453,6 +5619,7 @@
     <w:p>
       <w:pPr>
         <w:pStyle w:val="Heading2"/>
+        <w:spacing w:line="360" w:lineRule="auto"/>
         <w:jc w:val="both"/>
         <w:rPr>
           <w:rFonts w:ascii="Arial" w:cs="Arial" w:eastAsia="Arial" w:hAnsi="Arial"/>
@@ -5511,6 +5678,7 @@
           </w:tcPr>
           <w:p>
             <w:pPr>
+              <w:spacing w:line="360" w:lineRule="auto"/>
               <w:jc w:val="center"/>
               <w:rPr/>
             </w:pPr>
@@ -5538,6 +5706,7 @@
           </w:tcPr>
           <w:p>
             <w:pPr>
+              <w:spacing w:line="360" w:lineRule="auto"/>
               <w:jc w:val="center"/>
               <w:rPr/>
             </w:pPr>
@@ -5565,6 +5734,7 @@
           </w:tcPr>
           <w:p>
             <w:pPr>
+              <w:spacing w:line="360" w:lineRule="auto"/>
               <w:jc w:val="center"/>
               <w:rPr/>
             </w:pPr>
@@ -5596,6 +5766,7 @@
           <w:tcPr/>
           <w:p>
             <w:pPr>
+              <w:spacing w:line="360" w:lineRule="auto"/>
               <w:jc w:val="center"/>
               <w:rPr/>
             </w:pPr>
@@ -5618,6 +5789,7 @@
           <w:tcPr/>
           <w:p>
             <w:pPr>
+              <w:spacing w:line="360" w:lineRule="auto"/>
               <w:jc w:val="center"/>
               <w:rPr/>
             </w:pPr>
@@ -5640,6 +5812,7 @@
           <w:tcPr/>
           <w:p>
             <w:pPr>
+              <w:spacing w:line="360" w:lineRule="auto"/>
               <w:jc w:val="center"/>
               <w:rPr/>
             </w:pPr>
@@ -5668,6 +5841,7 @@
           <w:tcPr/>
           <w:p>
             <w:pPr>
+              <w:spacing w:line="360" w:lineRule="auto"/>
               <w:jc w:val="center"/>
               <w:rPr/>
             </w:pPr>
@@ -5690,6 +5864,7 @@
           <w:tcPr/>
           <w:p>
             <w:pPr>
+              <w:spacing w:line="360" w:lineRule="auto"/>
               <w:jc w:val="center"/>
               <w:rPr/>
             </w:pPr>
@@ -5712,6 +5887,7 @@
           <w:tcPr/>
           <w:p>
             <w:pPr>
+              <w:spacing w:line="360" w:lineRule="auto"/>
               <w:jc w:val="center"/>
               <w:rPr/>
             </w:pPr>
@@ -5740,6 +5916,7 @@
           <w:tcPr/>
           <w:p>
             <w:pPr>
+              <w:spacing w:line="360" w:lineRule="auto"/>
               <w:jc w:val="center"/>
               <w:rPr/>
             </w:pPr>
@@ -5762,6 +5939,7 @@
           <w:tcPr/>
           <w:p>
             <w:pPr>
+              <w:spacing w:line="360" w:lineRule="auto"/>
               <w:jc w:val="center"/>
               <w:rPr/>
             </w:pPr>
@@ -5784,6 +5962,7 @@
           <w:tcPr/>
           <w:p>
             <w:pPr>
+              <w:spacing w:line="360" w:lineRule="auto"/>
               <w:jc w:val="center"/>
               <w:rPr/>
             </w:pPr>
@@ -5812,6 +5991,7 @@
           <w:tcPr/>
           <w:p>
             <w:pPr>
+              <w:spacing w:line="360" w:lineRule="auto"/>
               <w:jc w:val="center"/>
               <w:rPr/>
             </w:pPr>
@@ -5834,6 +6014,7 @@
           <w:tcPr/>
           <w:p>
             <w:pPr>
+              <w:spacing w:line="360" w:lineRule="auto"/>
               <w:jc w:val="center"/>
               <w:rPr/>
             </w:pPr>
@@ -5856,6 +6037,7 @@
           <w:tcPr/>
           <w:p>
             <w:pPr>
+              <w:spacing w:line="360" w:lineRule="auto"/>
               <w:jc w:val="center"/>
               <w:rPr/>
             </w:pPr>
@@ -5878,6 +6060,7 @@
     </w:tbl>
     <w:p>
       <w:pPr>
+        <w:spacing w:line="360" w:lineRule="auto"/>
         <w:jc w:val="center"/>
         <w:rPr>
           <w:rFonts w:ascii="Arial" w:cs="Arial" w:eastAsia="Arial" w:hAnsi="Arial"/>
@@ -5903,6 +6086,7 @@
     </w:p>
     <w:p>
       <w:pPr>
+        <w:spacing w:line="360" w:lineRule="auto"/>
         <w:jc w:val="center"/>
         <w:rPr>
           <w:rFonts w:ascii="Arial" w:cs="Arial" w:eastAsia="Arial" w:hAnsi="Arial"/>
@@ -5914,12 +6098,12 @@
           <wp:inline distB="0" distT="0" distL="114300" distR="114300">
             <wp:extent cx="5220000" cy="2705700"/>
             <wp:effectExtent b="0" l="0" r="0" t="0"/>
-            <wp:docPr id="3" name="image3.png"/>
+            <wp:docPr id="3" name="image4.png"/>
             <a:graphic>
               <a:graphicData uri="http://schemas.openxmlformats.org/drawingml/2006/picture">
                 <pic:pic>
                   <pic:nvPicPr>
-                    <pic:cNvPr id="0" name="image3.png"/>
+                    <pic:cNvPr id="0" name="image4.png"/>
                     <pic:cNvPicPr preferRelativeResize="0"/>
                   </pic:nvPicPr>
                   <pic:blipFill>
@@ -5951,6 +6135,7 @@
     </w:p>
     <w:p>
       <w:pPr>
+        <w:spacing w:line="360" w:lineRule="auto"/>
         <w:jc w:val="center"/>
         <w:rPr>
           <w:rFonts w:ascii="Arial" w:cs="Arial" w:eastAsia="Arial" w:hAnsi="Arial"/>
@@ -5976,6 +6161,7 @@
     </w:p>
     <w:p>
       <w:pPr>
+        <w:spacing w:line="360" w:lineRule="auto"/>
         <w:jc w:val="both"/>
         <w:rPr>
           <w:rFonts w:ascii="Arial" w:cs="Arial" w:eastAsia="Arial" w:hAnsi="Arial"/>
@@ -5992,6 +6178,7 @@
     <w:p>
       <w:pPr>
         <w:pStyle w:val="Heading2"/>
+        <w:spacing w:line="360" w:lineRule="auto"/>
         <w:jc w:val="both"/>
         <w:rPr>
           <w:rFonts w:ascii="Arial" w:cs="Arial" w:eastAsia="Arial" w:hAnsi="Arial"/>
@@ -6050,6 +6237,7 @@
           </w:tcPr>
           <w:p>
             <w:pPr>
+              <w:spacing w:line="360" w:lineRule="auto"/>
               <w:jc w:val="center"/>
               <w:rPr/>
             </w:pPr>
@@ -6077,6 +6265,7 @@
           </w:tcPr>
           <w:p>
             <w:pPr>
+              <w:spacing w:line="360" w:lineRule="auto"/>
               <w:jc w:val="center"/>
               <w:rPr/>
             </w:pPr>
@@ -6104,6 +6293,7 @@
           </w:tcPr>
           <w:p>
             <w:pPr>
+              <w:spacing w:line="360" w:lineRule="auto"/>
               <w:jc w:val="center"/>
               <w:rPr/>
             </w:pPr>
@@ -6131,6 +6321,7 @@
           </w:tcPr>
           <w:p>
             <w:pPr>
+              <w:spacing w:line="360" w:lineRule="auto"/>
               <w:jc w:val="center"/>
               <w:rPr/>
             </w:pPr>
@@ -6158,6 +6349,7 @@
           </w:tcPr>
           <w:p>
             <w:pPr>
+              <w:spacing w:line="360" w:lineRule="auto"/>
               <w:jc w:val="center"/>
               <w:rPr/>
             </w:pPr>
@@ -6189,6 +6381,7 @@
           <w:tcPr/>
           <w:p>
             <w:pPr>
+              <w:spacing w:line="360" w:lineRule="auto"/>
               <w:jc w:val="center"/>
               <w:rPr/>
             </w:pPr>
@@ -6211,6 +6404,7 @@
           <w:tcPr/>
           <w:p>
             <w:pPr>
+              <w:spacing w:line="360" w:lineRule="auto"/>
               <w:jc w:val="center"/>
               <w:rPr/>
             </w:pPr>
@@ -6233,6 +6427,7 @@
           <w:tcPr/>
           <w:p>
             <w:pPr>
+              <w:spacing w:line="360" w:lineRule="auto"/>
               <w:jc w:val="center"/>
               <w:rPr/>
             </w:pPr>
@@ -6255,6 +6450,7 @@
           <w:tcPr/>
           <w:p>
             <w:pPr>
+              <w:spacing w:line="360" w:lineRule="auto"/>
               <w:jc w:val="center"/>
               <w:rPr/>
             </w:pPr>
@@ -6277,6 +6473,7 @@
           <w:tcPr/>
           <w:p>
             <w:pPr>
+              <w:spacing w:line="360" w:lineRule="auto"/>
               <w:jc w:val="center"/>
               <w:rPr/>
             </w:pPr>
@@ -6305,6 +6502,7 @@
           <w:tcPr/>
           <w:p>
             <w:pPr>
+              <w:spacing w:line="360" w:lineRule="auto"/>
               <w:jc w:val="center"/>
               <w:rPr/>
             </w:pPr>
@@ -6327,6 +6525,7 @@
           <w:tcPr/>
           <w:p>
             <w:pPr>
+              <w:spacing w:line="360" w:lineRule="auto"/>
               <w:jc w:val="center"/>
               <w:rPr/>
             </w:pPr>
@@ -6349,6 +6548,7 @@
           <w:tcPr/>
           <w:p>
             <w:pPr>
+              <w:spacing w:line="360" w:lineRule="auto"/>
               <w:jc w:val="center"/>
               <w:rPr/>
             </w:pPr>
@@ -6371,6 +6571,7 @@
           <w:tcPr/>
           <w:p>
             <w:pPr>
+              <w:spacing w:line="360" w:lineRule="auto"/>
               <w:jc w:val="center"/>
               <w:rPr/>
             </w:pPr>
@@ -6393,6 +6594,7 @@
           <w:tcPr/>
           <w:p>
             <w:pPr>
+              <w:spacing w:line="360" w:lineRule="auto"/>
               <w:jc w:val="center"/>
               <w:rPr/>
             </w:pPr>
@@ -6421,6 +6623,7 @@
           <w:tcPr/>
           <w:p>
             <w:pPr>
+              <w:spacing w:line="360" w:lineRule="auto"/>
               <w:jc w:val="center"/>
               <w:rPr/>
             </w:pPr>
@@ -6443,6 +6646,7 @@
           <w:tcPr/>
           <w:p>
             <w:pPr>
+              <w:spacing w:line="360" w:lineRule="auto"/>
               <w:jc w:val="center"/>
               <w:rPr/>
             </w:pPr>
@@ -6465,6 +6669,7 @@
           <w:tcPr/>
           <w:p>
             <w:pPr>
+              <w:spacing w:line="360" w:lineRule="auto"/>
               <w:jc w:val="center"/>
               <w:rPr/>
             </w:pPr>
@@ -6487,6 +6692,7 @@
           <w:tcPr/>
           <w:p>
             <w:pPr>
+              <w:spacing w:line="360" w:lineRule="auto"/>
               <w:jc w:val="center"/>
               <w:rPr/>
             </w:pPr>
@@ -6509,6 +6715,7 @@
           <w:tcPr/>
           <w:p>
             <w:pPr>
+              <w:spacing w:line="360" w:lineRule="auto"/>
               <w:jc w:val="center"/>
               <w:rPr/>
             </w:pPr>
@@ -6537,6 +6744,7 @@
           <w:tcPr/>
           <w:p>
             <w:pPr>
+              <w:spacing w:line="360" w:lineRule="auto"/>
               <w:jc w:val="center"/>
               <w:rPr/>
             </w:pPr>
@@ -6559,6 +6767,7 @@
           <w:tcPr/>
           <w:p>
             <w:pPr>
+              <w:spacing w:line="360" w:lineRule="auto"/>
               <w:jc w:val="center"/>
               <w:rPr/>
             </w:pPr>
@@ -6581,6 +6790,7 @@
           <w:tcPr/>
           <w:p>
             <w:pPr>
+              <w:spacing w:line="360" w:lineRule="auto"/>
               <w:jc w:val="center"/>
               <w:rPr/>
             </w:pPr>
@@ -6603,6 +6813,7 @@
           <w:tcPr/>
           <w:p>
             <w:pPr>
+              <w:spacing w:line="360" w:lineRule="auto"/>
               <w:jc w:val="center"/>
               <w:rPr/>
             </w:pPr>
@@ -6625,6 +6836,7 @@
           <w:tcPr/>
           <w:p>
             <w:pPr>
+              <w:spacing w:line="360" w:lineRule="auto"/>
               <w:jc w:val="center"/>
               <w:rPr/>
             </w:pPr>
@@ -6647,6 +6859,7 @@
     </w:tbl>
     <w:p>
       <w:pPr>
+        <w:spacing w:line="360" w:lineRule="auto"/>
         <w:jc w:val="center"/>
         <w:rPr>
           <w:rFonts w:ascii="Arial" w:cs="Arial" w:eastAsia="Arial" w:hAnsi="Arial"/>
@@ -6672,6 +6885,7 @@
     </w:p>
     <w:p>
       <w:pPr>
+        <w:spacing w:line="360" w:lineRule="auto"/>
         <w:jc w:val="center"/>
         <w:rPr>
           <w:rFonts w:ascii="Arial" w:cs="Arial" w:eastAsia="Arial" w:hAnsi="Arial"/>
@@ -6683,12 +6897,12 @@
           <wp:inline distB="0" distT="0" distL="114300" distR="114300">
             <wp:extent cx="5220000" cy="2746672"/>
             <wp:effectExtent b="0" l="0" r="0" t="0"/>
-            <wp:docPr id="4" name="image1.png"/>
+            <wp:docPr id="4" name="image3.png"/>
             <a:graphic>
               <a:graphicData uri="http://schemas.openxmlformats.org/drawingml/2006/picture">
                 <pic:pic>
                   <pic:nvPicPr>
-                    <pic:cNvPr id="0" name="image1.png"/>
+                    <pic:cNvPr id="0" name="image3.png"/>
                     <pic:cNvPicPr preferRelativeResize="0"/>
                   </pic:nvPicPr>
                   <pic:blipFill>
@@ -6720,6 +6934,7 @@
     </w:p>
     <w:p>
       <w:pPr>
+        <w:spacing w:line="360" w:lineRule="auto"/>
         <w:jc w:val="center"/>
         <w:rPr>
           <w:rFonts w:ascii="Arial" w:cs="Arial" w:eastAsia="Arial" w:hAnsi="Arial"/>
@@ -6745,6 +6960,7 @@
     </w:p>
     <w:p>
       <w:pPr>
+        <w:spacing w:line="360" w:lineRule="auto"/>
         <w:jc w:val="both"/>
         <w:rPr>
           <w:rFonts w:ascii="Arial" w:cs="Arial" w:eastAsia="Arial" w:hAnsi="Arial"/>
@@ -6760,6 +6976,7 @@
     </w:p>
     <w:p>
       <w:pPr>
+        <w:spacing w:line="360" w:lineRule="auto"/>
         <w:jc w:val="both"/>
         <w:rPr>
           <w:rFonts w:ascii="Arial" w:cs="Arial" w:eastAsia="Arial" w:hAnsi="Arial"/>
@@ -6776,14 +6993,17 @@
     <w:p>
       <w:pPr>
         <w:pStyle w:val="Heading2"/>
+        <w:spacing w:line="360" w:lineRule="auto"/>
         <w:jc w:val="both"/>
         <w:rPr>
           <w:rFonts w:ascii="Arial" w:cs="Arial" w:eastAsia="Arial" w:hAnsi="Arial"/>
-        </w:rPr>
-      </w:pPr>
-      <w:r>
-        <w:rPr>
-          <w:rFonts w:ascii="Arial" w:cs="Arial" w:eastAsia="Arial" w:hAnsi="Arial"/>
+          <w:color w:val="000000"/>
+        </w:rPr>
+      </w:pPr>
+      <w:r>
+        <w:rPr>
+          <w:rFonts w:ascii="Arial" w:cs="Arial" w:eastAsia="Arial" w:hAnsi="Arial"/>
+          <w:color w:val="000000"/>
           <w:rtl w:val="0"/>
         </w:rPr>
         <w:t xml:space="preserve">Remoção do último contato pelo telefone</w:t>
@@ -6828,6 +7048,7 @@
           </w:tcPr>
           <w:p>
             <w:pPr>
+              <w:spacing w:line="360" w:lineRule="auto"/>
               <w:jc w:val="center"/>
               <w:rPr/>
             </w:pPr>
@@ -6855,6 +7076,7 @@
           </w:tcPr>
           <w:p>
             <w:pPr>
+              <w:spacing w:line="360" w:lineRule="auto"/>
               <w:jc w:val="center"/>
               <w:rPr/>
             </w:pPr>
@@ -6882,6 +7104,7 @@
           </w:tcPr>
           <w:p>
             <w:pPr>
+              <w:spacing w:line="360" w:lineRule="auto"/>
               <w:jc w:val="center"/>
               <w:rPr/>
             </w:pPr>
@@ -6913,6 +7136,7 @@
           <w:tcPr/>
           <w:p>
             <w:pPr>
+              <w:spacing w:line="360" w:lineRule="auto"/>
               <w:jc w:val="center"/>
               <w:rPr/>
             </w:pPr>
@@ -6935,6 +7159,7 @@
           <w:tcPr/>
           <w:p>
             <w:pPr>
+              <w:spacing w:line="360" w:lineRule="auto"/>
               <w:jc w:val="center"/>
               <w:rPr/>
             </w:pPr>
@@ -6957,6 +7182,7 @@
           <w:tcPr/>
           <w:p>
             <w:pPr>
+              <w:spacing w:line="360" w:lineRule="auto"/>
               <w:jc w:val="center"/>
               <w:rPr/>
             </w:pPr>
@@ -6985,6 +7211,7 @@
           <w:tcPr/>
           <w:p>
             <w:pPr>
+              <w:spacing w:line="360" w:lineRule="auto"/>
               <w:jc w:val="center"/>
               <w:rPr/>
             </w:pPr>
@@ -7007,6 +7234,7 @@
           <w:tcPr/>
           <w:p>
             <w:pPr>
+              <w:spacing w:line="360" w:lineRule="auto"/>
               <w:jc w:val="center"/>
               <w:rPr/>
             </w:pPr>
@@ -7029,6 +7257,7 @@
           <w:tcPr/>
           <w:p>
             <w:pPr>
+              <w:spacing w:line="360" w:lineRule="auto"/>
               <w:jc w:val="center"/>
               <w:rPr/>
             </w:pPr>
@@ -7057,6 +7286,7 @@
           <w:tcPr/>
           <w:p>
             <w:pPr>
+              <w:spacing w:line="360" w:lineRule="auto"/>
               <w:jc w:val="center"/>
               <w:rPr/>
             </w:pPr>
@@ -7079,6 +7309,7 @@
           <w:tcPr/>
           <w:p>
             <w:pPr>
+              <w:spacing w:line="360" w:lineRule="auto"/>
               <w:jc w:val="center"/>
               <w:rPr/>
             </w:pPr>
@@ -7101,6 +7332,7 @@
           <w:tcPr/>
           <w:p>
             <w:pPr>
+              <w:spacing w:line="360" w:lineRule="auto"/>
               <w:jc w:val="center"/>
               <w:rPr/>
             </w:pPr>
@@ -7129,6 +7361,7 @@
           <w:tcPr/>
           <w:p>
             <w:pPr>
+              <w:spacing w:line="360" w:lineRule="auto"/>
               <w:jc w:val="center"/>
               <w:rPr/>
             </w:pPr>
@@ -7151,6 +7384,7 @@
           <w:tcPr/>
           <w:p>
             <w:pPr>
+              <w:spacing w:line="360" w:lineRule="auto"/>
               <w:jc w:val="center"/>
               <w:rPr/>
             </w:pPr>
@@ -7173,6 +7407,7 @@
           <w:tcPr/>
           <w:p>
             <w:pPr>
+              <w:spacing w:line="360" w:lineRule="auto"/>
               <w:jc w:val="center"/>
               <w:rPr/>
             </w:pPr>
@@ -7195,6 +7430,7 @@
     </w:tbl>
     <w:p>
       <w:pPr>
+        <w:spacing w:line="360" w:lineRule="auto"/>
         <w:jc w:val="center"/>
         <w:rPr>
           <w:rFonts w:ascii="Arial" w:cs="Arial" w:eastAsia="Arial" w:hAnsi="Arial"/>
@@ -7220,6 +7456,7 @@
     </w:p>
     <w:p>
       <w:pPr>
+        <w:spacing w:line="360" w:lineRule="auto"/>
         <w:jc w:val="center"/>
         <w:rPr>
           <w:rFonts w:ascii="Arial" w:cs="Arial" w:eastAsia="Arial" w:hAnsi="Arial"/>
@@ -7231,12 +7468,12 @@
           <wp:inline distB="0" distT="0" distL="114300" distR="114300">
             <wp:extent cx="5220000" cy="2705700"/>
             <wp:effectExtent b="0" l="0" r="0" t="0"/>
-            <wp:docPr id="1" name="image4.png"/>
+            <wp:docPr id="1" name="image5.png"/>
             <a:graphic>
               <a:graphicData uri="http://schemas.openxmlformats.org/drawingml/2006/picture">
                 <pic:pic>
                   <pic:nvPicPr>
-                    <pic:cNvPr id="0" name="image4.png"/>
+                    <pic:cNvPr id="0" name="image5.png"/>
                     <pic:cNvPicPr preferRelativeResize="0"/>
                   </pic:nvPicPr>
                   <pic:blipFill>
@@ -7268,6 +7505,7 @@
     </w:p>
     <w:p>
       <w:pPr>
+        <w:spacing w:line="360" w:lineRule="auto"/>
         <w:jc w:val="center"/>
         <w:rPr>
           <w:rFonts w:ascii="Arial" w:cs="Arial" w:eastAsia="Arial" w:hAnsi="Arial"/>
@@ -7293,6 +7531,7 @@
     </w:p>
     <w:p>
       <w:pPr>
+        <w:spacing w:line="360" w:lineRule="auto"/>
         <w:jc w:val="both"/>
         <w:rPr>
           <w:rFonts w:ascii="Arial" w:cs="Arial" w:eastAsia="Arial" w:hAnsi="Arial"/>
@@ -7309,6 +7548,7 @@
     <w:p>
       <w:pPr>
         <w:pStyle w:val="Heading2"/>
+        <w:spacing w:line="360" w:lineRule="auto"/>
         <w:jc w:val="both"/>
         <w:rPr>
           <w:rFonts w:ascii="Arial" w:cs="Arial" w:eastAsia="Arial" w:hAnsi="Arial"/>
@@ -7326,6 +7566,7 @@
     </w:p>
     <w:p>
       <w:pPr>
+        <w:spacing w:line="360" w:lineRule="auto"/>
         <w:jc w:val="both"/>
         <w:rPr>
           <w:rFonts w:ascii="Arial" w:cs="Arial" w:eastAsia="Arial" w:hAnsi="Arial"/>
@@ -7341,6 +7582,7 @@
     </w:p>
     <w:p>
       <w:pPr>
+        <w:spacing w:line="360" w:lineRule="auto"/>
         <w:jc w:val="both"/>
         <w:rPr>
           <w:rFonts w:ascii="Arial" w:cs="Arial" w:eastAsia="Arial" w:hAnsi="Arial"/>
@@ -7356,6 +7598,7 @@
     </w:p>
     <w:p>
       <w:pPr>
+        <w:spacing w:line="360" w:lineRule="auto"/>
         <w:jc w:val="both"/>
         <w:rPr>
           <w:rFonts w:ascii="Arial" w:cs="Arial" w:eastAsia="Arial" w:hAnsi="Arial"/>
@@ -7371,6 +7614,7 @@
     </w:p>
     <w:p>
       <w:pPr>
+        <w:spacing w:line="360" w:lineRule="auto"/>
         <w:jc w:val="both"/>
         <w:rPr>
           <w:rFonts w:ascii="Arial" w:cs="Arial" w:eastAsia="Arial" w:hAnsi="Arial"/>
@@ -7386,6 +7630,7 @@
     </w:p>
     <w:p>
       <w:pPr>
+        <w:spacing w:line="360" w:lineRule="auto"/>
         <w:jc w:val="both"/>
         <w:rPr>
           <w:rFonts w:ascii="Arial" w:cs="Arial" w:eastAsia="Arial" w:hAnsi="Arial"/>
@@ -7399,7 +7644,7 @@
     </w:p>
     <w:p>
       <w:pPr>
-        <w:spacing w:after="120" w:lineRule="auto"/>
+        <w:spacing w:after="120" w:line="360" w:lineRule="auto"/>
         <w:jc w:val="both"/>
         <w:rPr>
           <w:rFonts w:ascii="Arial" w:cs="Arial" w:eastAsia="Arial" w:hAnsi="Arial"/>
@@ -7437,7 +7682,7 @@
     </w:p>
     <w:p>
       <w:pPr>
-        <w:spacing w:after="120" w:lineRule="auto"/>
+        <w:spacing w:after="120" w:line="360" w:lineRule="auto"/>
         <w:jc w:val="both"/>
         <w:rPr>
           <w:rFonts w:ascii="Arial" w:cs="Arial" w:eastAsia="Arial" w:hAnsi="Arial"/>
@@ -7455,7 +7700,7 @@
     </w:p>
     <w:p>
       <w:pPr>
-        <w:spacing w:after="120" w:lineRule="auto"/>
+        <w:spacing w:after="120" w:line="360" w:lineRule="auto"/>
         <w:jc w:val="both"/>
         <w:rPr>
           <w:rFonts w:ascii="Arial" w:cs="Arial" w:eastAsia="Arial" w:hAnsi="Arial"/>
@@ -7469,7 +7714,7 @@
     </w:p>
     <w:p>
       <w:pPr>
-        <w:spacing w:after="120" w:lineRule="auto"/>
+        <w:spacing w:after="120" w:line="360" w:lineRule="auto"/>
         <w:jc w:val="both"/>
         <w:rPr>
           <w:rFonts w:ascii="Arial" w:cs="Arial" w:eastAsia="Arial" w:hAnsi="Arial"/>
@@ -7487,7 +7732,7 @@
     </w:p>
     <w:p>
       <w:pPr>
-        <w:spacing w:after="120" w:lineRule="auto"/>
+        <w:spacing w:after="120" w:line="360" w:lineRule="auto"/>
         <w:jc w:val="both"/>
         <w:rPr>
           <w:rFonts w:ascii="Arial" w:cs="Arial" w:eastAsia="Arial" w:hAnsi="Arial"/>

</xml_diff>